<commit_message>
docs: finalize Rental Scanning requirements (v3) with decision rationale
Fold in all decisions from the analysis: Option (iii) container model
(serial-tracked crate as the durable reusable identity), serial-scan =
package-scan, definition-driven set-scan, strict-fit + split prompt,
any-operation-type, multilingual (nl/fr). Adds a Design Decisions &
Rationale section documenting chosen vs rejected options and why.

Co-Authored-By: Claude Opus 4.8 <noreply@anthropic.com>
Claude-Session: https://claude.ai/code/session_015UyktmijNHjiCtQB359rzX
</commit_message>
<xml_diff>
--- a/docs/rental_scanning_requirements.docx
+++ b/docs/rental_scanning_requirements.docx
@@ -18,7 +18,7 @@
           <w:color w:val="1F497D"/>
           <w:sz w:val="26"/>
         </w:rPr>
-        <w:t>Functional &amp; Technical Requirements — Backend / Inventory + Barcode (v2)</w:t>
+        <w:t>Functional &amp; Technical Requirements — Backend / Inventory + Barcode (v3, FINAL)</w:t>
       </w:r>
     </w:p>
     <w:tbl>
@@ -201,7 +201,7 @@
           </w:tcPr>
           <w:p>
             <w:r>
-              <w:t>Draft for approval — implementation not started</w:t>
+              <w:t>Final analysis — approved; implementation not started (no code yet)</w:t>
             </w:r>
           </w:p>
         </w:tc>
@@ -246,7 +246,7 @@
           <w:b w:val="0"/>
           <w:i w:val="0"/>
         </w:rPr>
-        <w:t>Warehouse staff prepare sets (combined products) into physical packages ahead of orders, to speed up picking. Which prepared package serves which order is decided only at pick time ("late binding"), by manually scanning or selecting the package on the operation. This document specifies that behaviour. Preparation (building packages) is done manually with standard Odoo.</w:t>
+        <w:t>Warehouse staff prepare sets (combined products) into physical packages ahead of orders to speed up picking. Which prepared package serves which order is decided only at pick time ("late binding"), by manually scanning or selecting the package on the operation. This document specifies that behaviour and records WHY each decision was taken. Preparation (building packages) is done manually with standard Odoo tools.</w:t>
       </w:r>
     </w:p>
     <w:p>
@@ -254,7 +254,7 @@
         <w:pStyle w:val="Heading1"/>
       </w:pPr>
       <w:r>
-        <w:t>2. Confirmations Requested</w:t>
+        <w:t>2. Confirmations (verified in code)</w:t>
       </w:r>
     </w:p>
     <w:p>
@@ -262,7 +262,7 @@
         <w:pStyle w:val="ListBullet"/>
       </w:pPr>
       <w:r>
-        <w:t>Multi-step routes: the rental-set logic is NOT gated by operation type. Set grouping, the component prefix "[Set] Product", indentation and the zero-demand header work identically on Pick, Pack, Ship and single-step Delivery. Verified in code (keys off "outbound sale chain": sale_id set AND return_id not set) — no per-operation-type branch exists.</w:t>
+        <w:t>Multi-step routes: the rental-set logic is NOT gated by operation type. Grouping, the "[Set] Product" prefix, indentation and the zero-demand header work identically on Pick, Pack, Ship and single-step Delivery. (Keys off "outbound sale chain": sale_id set AND return_id not set.)</w:t>
       </w:r>
     </w:p>
     <w:p>
@@ -270,7 +270,7 @@
         <w:pStyle w:val="ListBullet"/>
       </w:pPr>
       <w:r>
-        <w:t>Set header disappears at the client: set grouping and the header are shown ONLY on the outbound sale chain. Return pickings (return_id set) show NO header and NO prefix — the warehouse has no control over how the client returns goods. So once goods reach the client and come back, the set-header is gone and items return as plain products. Verified in rental_set (_compute_rental_set_show_grouping and _compute_description_picking both exclude returns).</w:t>
+        <w:t>Set header disappears at the client: grouping and the header show ONLY on the outbound sale chain. Return pickings (return_id set) show NO header and NO prefix, because the warehouse cannot control how the client returns goods. So once goods reach the client and come back, the set-header is gone and items return as plain products. (Verified in _compute_rental_set_show_grouping and _compute_description_picking.)</w:t>
       </w:r>
     </w:p>
     <w:p>
@@ -278,7 +278,7 @@
         <w:pStyle w:val="Heading1"/>
       </w:pPr>
       <w:r>
-        <w:t>3. Standard Odoo Mechanisms Reviewed (important)</w:t>
+        <w:t>3. Design Decisions &amp; Rationale</w:t>
       </w:r>
     </w:p>
     <w:p>
@@ -287,7 +287,587 @@
           <w:b w:val="0"/>
           <w:i w:val="0"/>
         </w:rPr>
-        <w:t>A review of Odoo 19 shows much of this is NATIVE. Findings:</w:t>
+        <w:t>This section records what was chosen, what was rejected, and why — for future maintainers.</w:t>
+      </w:r>
+    </w:p>
+    <w:tbl>
+      <w:tblPr>
+        <w:tblStyle w:val="LightGrid-Accent1"/>
+        <w:tblW w:type="auto" w:w="0"/>
+        <w:jc w:val="center"/>
+        <w:tblLook w:firstColumn="1" w:firstRow="1" w:lastColumn="0" w:lastRow="0" w:noHBand="0" w:noVBand="1" w:val="04A0"/>
+      </w:tblPr>
+      <w:tblGrid>
+        <w:gridCol w:w="2160"/>
+        <w:gridCol w:w="2160"/>
+        <w:gridCol w:w="2160"/>
+        <w:gridCol w:w="2160"/>
+      </w:tblGrid>
+      <w:tr>
+        <w:tc>
+          <w:tcPr>
+            <w:tcW w:type="dxa" w:w="2160"/>
+          </w:tcPr>
+          <w:p>
+            <w:r>
+              <w:rPr>
+                <w:b/>
+              </w:rPr>
+              <w:t>Decision</w:t>
+            </w:r>
+          </w:p>
+        </w:tc>
+        <w:tc>
+          <w:tcPr>
+            <w:tcW w:type="dxa" w:w="2160"/>
+          </w:tcPr>
+          <w:p>
+            <w:r>
+              <w:rPr>
+                <w:b/>
+              </w:rPr>
+              <w:t>Chosen</w:t>
+            </w:r>
+          </w:p>
+        </w:tc>
+        <w:tc>
+          <w:tcPr>
+            <w:tcW w:type="dxa" w:w="2160"/>
+          </w:tcPr>
+          <w:p>
+            <w:r>
+              <w:rPr>
+                <w:b/>
+              </w:rPr>
+              <w:t>Rejected alternative(s)</w:t>
+            </w:r>
+          </w:p>
+        </w:tc>
+        <w:tc>
+          <w:tcPr>
+            <w:tcW w:type="dxa" w:w="2160"/>
+          </w:tcPr>
+          <w:p>
+            <w:r>
+              <w:rPr>
+                <w:b/>
+              </w:rPr>
+              <w:t>Why</w:t>
+            </w:r>
+          </w:p>
+        </w:tc>
+      </w:tr>
+      <w:tr>
+        <w:tc>
+          <w:tcPr>
+            <w:tcW w:type="dxa" w:w="2160"/>
+          </w:tcPr>
+          <w:p>
+            <w:r>
+              <w:t>D-01 Manual late binding (Option A)</w:t>
+            </w:r>
+          </w:p>
+        </w:tc>
+        <w:tc>
+          <w:tcPr>
+            <w:tcW w:type="dxa" w:w="2160"/>
+          </w:tcPr>
+          <w:p>
+            <w:r>
+              <w:t>Scan/select a prepared package at pick time.</w:t>
+            </w:r>
+          </w:p>
+        </w:tc>
+        <w:tc>
+          <w:tcPr>
+            <w:tcW w:type="dxa" w:w="2160"/>
+          </w:tcPr>
+          <w:p>
+            <w:r>
+              <w:t>Auto-reserve a matching package (Option B).</w:t>
+            </w:r>
+          </w:p>
+        </w:tc>
+        <w:tc>
+          <w:tcPr>
+            <w:tcW w:type="dxa" w:w="2160"/>
+          </w:tcPr>
+          <w:p>
+            <w:r>
+              <w:t>You do not know which package serves which order until picking; manual selection is closest to Odoo standard. Auto-reservation adds significant matching logic and edge cases; deferred, can be layered later.</w:t>
+            </w:r>
+          </w:p>
+        </w:tc>
+      </w:tr>
+      <w:tr>
+        <w:tc>
+          <w:tcPr>
+            <w:tcW w:type="dxa" w:w="2160"/>
+          </w:tcPr>
+          <w:p>
+            <w:r>
+              <w:t>D-02 Container = generic package, reconciled by ACTUAL contents</w:t>
+            </w:r>
+          </w:p>
+        </w:tc>
+        <w:tc>
+          <w:tcPr>
+            <w:tcW w:type="dxa" w:w="2160"/>
+          </w:tcPr>
+          <w:p>
+            <w:r>
+              <w:t>Read the package's real quants and match them to demand.</w:t>
+            </w:r>
+          </w:p>
+        </w:tc>
+        <w:tc>
+          <w:tcPr>
+            <w:tcW w:type="dxa" w:w="2160"/>
+          </w:tcPr>
+          <w:p>
+            <w:r>
+              <w:t>Infer contents/"the set" from the container or its crate serial (old Approach B).</w:t>
+            </w:r>
+          </w:p>
+        </w:tc>
+        <w:tc>
+          <w:tcPr>
+            <w:tcW w:type="dxa" w:w="2160"/>
+          </w:tcPr>
+          <w:p>
+            <w:r>
+              <w:t>A crate is reusable and its contents vary (40 glasses today, 40 plates tomorrow). The identity of the box therefore says nothing about what is inside; only the live contents are trustworthy.</w:t>
+            </w:r>
+          </w:p>
+        </w:tc>
+      </w:tr>
+      <w:tr>
+        <w:tc>
+          <w:tcPr>
+            <w:tcW w:type="dxa" w:w="2160"/>
+          </w:tcPr>
+          <w:p>
+            <w:r>
+              <w:t>D-03 Returnable container = serial-tracked PRODUCT</w:t>
+            </w:r>
+          </w:p>
+        </w:tc>
+        <w:tc>
+          <w:tcPr>
+            <w:tcW w:type="dxa" w:w="2160"/>
+          </w:tcPr>
+          <w:p>
+            <w:r>
+              <w:t>Model the crate (Eurobak 40) as a serial-tracked product.</w:t>
+            </w:r>
+          </w:p>
+        </w:tc>
+        <w:tc>
+          <w:tcPr>
+            <w:tcW w:type="dxa" w:w="2160"/>
+          </w:tcPr>
+          <w:p>
+            <w:r>
+              <w:t>A custom "returnable packaging" object; forcing package-ID = serial.</w:t>
+            </w:r>
+          </w:p>
+        </w:tc>
+        <w:tc>
+          <w:tcPr>
+            <w:tcW w:type="dxa" w:w="2160"/>
+          </w:tcPr>
+          <w:p>
+            <w:r>
+              <w:t>Odoo has no first-class returnable-transport-packaging. The standard pattern is a tracked/rented product; it gives per-crate delivery/return identity natively and is counted like any product. Coupling a package name to a serial fights the generic/reusable model and needs custom code.</w:t>
+            </w:r>
+          </w:p>
+        </w:tc>
+      </w:tr>
+      <w:tr>
+        <w:tc>
+          <w:tcPr>
+            <w:tcW w:type="dxa" w:w="2160"/>
+          </w:tcPr>
+          <w:p>
+            <w:r>
+              <w:t>D-04 Option (iii): package dissolves at delivery; serial is the durable label</w:t>
+            </w:r>
+          </w:p>
+        </w:tc>
+        <w:tc>
+          <w:tcPr>
+            <w:tcW w:type="dxa" w:w="2160"/>
+          </w:tcPr>
+          <w:p>
+            <w:r>
+              <w:t>The serial-tracked crate itself travels to the client and returns, so it IS the reusable label.</w:t>
+            </w:r>
+          </w:p>
+        </w:tc>
+        <w:tc>
+          <w:tcPr>
+            <w:tcW w:type="dxa" w:w="2160"/>
+          </w:tcPr>
+          <w:p>
+            <w:r>
+              <w:t>(ii-a) disposable box that travels; (ii-b) reusable box + custom override to travel.</w:t>
+            </w:r>
+          </w:p>
+        </w:tc>
+        <w:tc>
+          <w:tcPr>
+            <w:tcW w:type="dxa" w:w="2160"/>
+          </w:tcPr>
+          <w:p>
+            <w:r>
+              <w:t>The crate serial already provides "travels + reused" from the product side, with per-crate identity, and needs almost no customization. (ii-a) has no reuse lifecycle and clutters customer locations; (ii-b) adds custom code to make a reusable box travel — unnecessary.</w:t>
+            </w:r>
+          </w:p>
+        </w:tc>
+      </w:tr>
+      <w:tr>
+        <w:tc>
+          <w:tcPr>
+            <w:tcW w:type="dxa" w:w="2160"/>
+          </w:tcPr>
+          <w:p>
+            <w:r>
+              <w:t>D-05 Serial-scan is equivalent to package-scan</w:t>
+            </w:r>
+          </w:p>
+        </w:tc>
+        <w:tc>
+          <w:tcPr>
+            <w:tcW w:type="dxa" w:w="2160"/>
+          </w:tcPr>
+          <w:p>
+            <w:r>
+              <w:t>Scanning a content serial resolves to the package that currently holds it and picks that package's actual contents.</w:t>
+            </w:r>
+          </w:p>
+        </w:tc>
+        <w:tc>
+          <w:tcPr>
+            <w:tcW w:type="dxa" w:w="2160"/>
+          </w:tcPr>
+          <w:p>
+            <w:r>
+              <w:t>Serial-scan drives a set definition.</w:t>
+            </w:r>
+          </w:p>
+        </w:tc>
+        <w:tc>
+          <w:tcPr>
+            <w:tcW w:type="dxa" w:w="2160"/>
+          </w:tcPr>
+          <w:p>
+            <w:r>
+              <w:t>Contents-driven resolution stays truthful when contents vary; Odoo can natively find which package holds a serial. Driving a set from a serial was rejected under D-02.</w:t>
+            </w:r>
+          </w:p>
+        </w:tc>
+      </w:tr>
+      <w:tr>
+        <w:tc>
+          <w:tcPr>
+            <w:tcW w:type="dxa" w:w="2160"/>
+          </w:tcPr>
+          <w:p>
+            <w:r>
+              <w:t>D-06 Set-scan is a separate, definition-driven feature</w:t>
+            </w:r>
+          </w:p>
+        </w:tc>
+        <w:tc>
+          <w:tcPr>
+            <w:tcW w:type="dxa" w:w="2160"/>
+          </w:tcPr>
+          <w:p>
+            <w:r>
+              <w:t>Scanning a set barcode fills the set's expected components (PPB-12); no physical package needed.</w:t>
+            </w:r>
+          </w:p>
+        </w:tc>
+        <w:tc>
+          <w:tcPr>
+            <w:tcW w:type="dxa" w:w="2160"/>
+          </w:tcPr>
+          <w:p>
+            <w:r>
+              <w:t>Merge set-scan and container-scan into one.</w:t>
+            </w:r>
+          </w:p>
+        </w:tc>
+        <w:tc>
+          <w:tcPr>
+            <w:tcW w:type="dxa" w:w="2160"/>
+          </w:tcPr>
+          <w:p>
+            <w:r>
+              <w:t>They solve different needs: container-scan reflects physical truth; set-scan fills demand when no prepared box exists. Keeping them separate avoids conflating physical contents with a template.</w:t>
+            </w:r>
+          </w:p>
+        </w:tc>
+      </w:tr>
+      <w:tr>
+        <w:tc>
+          <w:tcPr>
+            <w:tcW w:type="dxa" w:w="2160"/>
+          </w:tcPr>
+          <w:p>
+            <w:r>
+              <w:t>D-07 Overflow → ask to split (not hard-fail)</w:t>
+            </w:r>
+          </w:p>
+        </w:tc>
+        <w:tc>
+          <w:tcPr>
+            <w:tcW w:type="dxa" w:w="2160"/>
+          </w:tcPr>
+          <w:p>
+            <w:r>
+              <w:t>If a package holds more than needed, prompt the picker to split.</w:t>
+            </w:r>
+          </w:p>
+        </w:tc>
+        <w:tc>
+          <w:tcPr>
+            <w:tcW w:type="dxa" w:w="2160"/>
+          </w:tcPr>
+          <w:p>
+            <w:r>
+              <w:t>Silently split, or hard-reject.</w:t>
+            </w:r>
+          </w:p>
+        </w:tc>
+        <w:tc>
+          <w:tcPr>
+            <w:tcW w:type="dxa" w:w="2160"/>
+          </w:tcPr>
+          <w:p>
+            <w:r>
+              <w:t>Removing items from a package is real physical work that must be acknowledged; a prompt is more elegant than a blunt error and prevents silent, invisible splitting.</w:t>
+            </w:r>
+          </w:p>
+        </w:tc>
+      </w:tr>
+      <w:tr>
+        <w:tc>
+          <w:tcPr>
+            <w:tcW w:type="dxa" w:w="2160"/>
+          </w:tcPr>
+          <w:p>
+            <w:r>
+              <w:t>D-08 Extra stock must be added manually</w:t>
+            </w:r>
+          </w:p>
+        </w:tc>
+        <w:tc>
+          <w:tcPr>
+            <w:tcW w:type="dxa" w:w="2160"/>
+          </w:tcPr>
+          <w:p>
+            <w:r>
+              <w:t>If more than the package is genuinely needed, the picker adds a line explicitly.</w:t>
+            </w:r>
+          </w:p>
+        </w:tc>
+        <w:tc>
+          <w:tcPr>
+            <w:tcW w:type="dxa" w:w="2160"/>
+          </w:tcPr>
+          <w:p>
+            <w:r>
+              <w:t>Auto-pull extra from the package/stock.</w:t>
+            </w:r>
+          </w:p>
+        </w:tc>
+        <w:tc>
+          <w:tcPr>
+            <w:tcW w:type="dxa" w:w="2160"/>
+          </w:tcPr>
+          <w:p>
+            <w:r>
+              <w:t>Keeps additions explicit and auditable; prevents the demand-0 overflow seen previously.</w:t>
+            </w:r>
+          </w:p>
+        </w:tc>
+      </w:tr>
+      <w:tr>
+        <w:tc>
+          <w:tcPr>
+            <w:tcW w:type="dxa" w:w="2160"/>
+          </w:tcPr>
+          <w:p>
+            <w:r>
+              <w:t>D-09 Works on ANY operation type</w:t>
+            </w:r>
+          </w:p>
+        </w:tc>
+        <w:tc>
+          <w:tcPr>
+            <w:tcW w:type="dxa" w:w="2160"/>
+          </w:tcPr>
+          <w:p>
+            <w:r>
+              <w:t>Outbound, internal and inbound.</w:t>
+            </w:r>
+          </w:p>
+        </w:tc>
+        <w:tc>
+          <w:tcPr>
+            <w:tcW w:type="dxa" w:w="2160"/>
+          </w:tcPr>
+          <w:p>
+            <w:r>
+              <w:t>Restrict to outbound only.</w:t>
+            </w:r>
+          </w:p>
+        </w:tc>
+        <w:tc>
+          <w:tcPr>
+            <w:tcW w:type="dxa" w:w="2160"/>
+          </w:tcPr>
+          <w:p>
+            <w:r>
+              <w:t>The same regrouping is useful on inbound (e.g. regroup returned products into packages before moving to stock). No reason to gate by operation type.</w:t>
+            </w:r>
+          </w:p>
+        </w:tc>
+      </w:tr>
+      <w:tr>
+        <w:tc>
+          <w:tcPr>
+            <w:tcW w:type="dxa" w:w="2160"/>
+          </w:tcPr>
+          <w:p>
+            <w:r>
+              <w:t>D-10 One module: rental_scanning</w:t>
+            </w:r>
+          </w:p>
+        </w:tc>
+        <w:tc>
+          <w:tcPr>
+            <w:tcW w:type="dxa" w:w="2160"/>
+          </w:tcPr>
+          <w:p>
+            <w:r>
+              <w:t>A single barcode module, depending only on stock_barcode.</w:t>
+            </w:r>
+          </w:p>
+        </w:tc>
+        <w:tc>
+          <w:tcPr>
+            <w:tcW w:type="dxa" w:w="2160"/>
+          </w:tcPr>
+          <w:p>
+            <w:r>
+              <w:t>Put it inside rental_set; or many tiny modules.</w:t>
+            </w:r>
+          </w:p>
+        </w:tc>
+        <w:tc>
+          <w:tcPr>
+            <w:tcW w:type="dxa" w:w="2160"/>
+          </w:tcPr>
+          <w:p>
+            <w:r>
+              <w:t>The feature is generic (works for non-set pickings too) and must not force an Enterprise (stock_barcode) hard-dependency onto rental_set. One module is the home for future scanning work; split only when a different dependency footprint appears.</w:t>
+            </w:r>
+          </w:p>
+        </w:tc>
+      </w:tr>
+      <w:tr>
+        <w:tc>
+          <w:tcPr>
+            <w:tcW w:type="dxa" w:w="2160"/>
+          </w:tcPr>
+          <w:p>
+            <w:r>
+              <w:t>D-11 Reuse native reusable package types</w:t>
+            </w:r>
+          </w:p>
+        </w:tc>
+        <w:tc>
+          <w:tcPr>
+            <w:tcW w:type="dxa" w:w="2160"/>
+          </w:tcPr>
+          <w:p>
+            <w:r>
+              <w:t>Lean on package_use = "reusable" for scan-adds-contents and empty-after-use.</w:t>
+            </w:r>
+          </w:p>
+        </w:tc>
+        <w:tc>
+          <w:tcPr>
+            <w:tcW w:type="dxa" w:w="2160"/>
+          </w:tcPr>
+          <w:p>
+            <w:r>
+              <w:t>Build a custom "reusable label" field / mechanism.</w:t>
+            </w:r>
+          </w:p>
+        </w:tc>
+        <w:tc>
+          <w:tcPr>
+            <w:tcW w:type="dxa" w:w="2160"/>
+          </w:tcPr>
+          <w:p>
+            <w:r>
+              <w:t>Native behaviour already covers scan-adds-contents and freeing the box; a custom metadata field was dropped as redundant. Keeps packages generic.</w:t>
+            </w:r>
+          </w:p>
+        </w:tc>
+      </w:tr>
+      <w:tr>
+        <w:tc>
+          <w:tcPr>
+            <w:tcW w:type="dxa" w:w="2160"/>
+          </w:tcPr>
+          <w:p>
+            <w:r>
+              <w:t>D-12 Multilingual (en + nl + fr)</w:t>
+            </w:r>
+          </w:p>
+        </w:tc>
+        <w:tc>
+          <w:tcPr>
+            <w:tcW w:type="dxa" w:w="2160"/>
+          </w:tcPr>
+          <w:p>
+            <w:r>
+              <w:t>Ship translations.</w:t>
+            </w:r>
+          </w:p>
+        </w:tc>
+        <w:tc>
+          <w:tcPr>
+            <w:tcW w:type="dxa" w:w="2160"/>
+          </w:tcPr>
+          <w:p>
+            <w:r>
+              <w:t>English-only.</w:t>
+            </w:r>
+          </w:p>
+        </w:tc>
+        <w:tc>
+          <w:tcPr>
+            <w:tcW w:type="dxa" w:w="2160"/>
+          </w:tcPr>
+          <w:p>
+            <w:r>
+              <w:t>Belgian operation; warehouse staff use Dutch/French.</w:t>
+            </w:r>
+          </w:p>
+        </w:tc>
+      </w:tr>
+    </w:tbl>
+    <w:p>
+      <w:pPr>
+        <w:pStyle w:val="Heading1"/>
+      </w:pPr>
+      <w:r>
+        <w:t>4. Standard Odoo Mechanisms Reviewed</w:t>
       </w:r>
     </w:p>
     <w:tbl>
@@ -324,7 +904,7 @@
               <w:rPr>
                 <w:b/>
               </w:rPr>
-              <w:t>What Odoo 19 provides</w:t>
+              <w:t>Relevance</w:t>
             </w:r>
           </w:p>
         </w:tc>
@@ -346,7 +926,7 @@
           </w:tcPr>
           <w:p>
             <w:r>
-              <w:t>stock.package.type.package_use = "reusable" (vs "disposable"). Odoo help: "Reusable boxes are used for batch picking and emptied afterwards to be reused. In the Barcode application, scanning a reusable box will add the products in this box." → scan-adds-contents is NATIVE.</w:t>
+              <w:t>package_use = "reusable": scanning a reusable box adds its products; the box is emptied afterwards and reused. Basis for D-11.</w:t>
             </w:r>
           </w:p>
         </w:tc>
@@ -368,7 +948,7 @@
           </w:tcPr>
           <w:p>
             <w:r>
-              <w:t>_check_entire_pack: for entire-pack moves, a NON-reusable box becomes the result_package (travels with the goods); a REUSABLE box is NOT set as result package → it stays behind, emptied and reused. Matches "label reused, contents not fixed to the box".</w:t>
+              <w:t>_check_entire_pack attaches a DISPOSABLE box to the goods (it travels) but leaves a REUSABLE box behind (it stays and is reused). Basis for D-04.</w:t>
             </w:r>
           </w:p>
         </w:tc>
@@ -380,7 +960,7 @@
           </w:tcPr>
           <w:p>
             <w:r>
-              <w:t>Usable packages in barcode</w:t>
+              <w:t>Serial / lot tracking</w:t>
             </w:r>
           </w:p>
         </w:tc>
@@ -390,7 +970,7 @@
           </w:tcPr>
           <w:p>
             <w:r>
-              <w:t>_get_usable_packages loads reusable packages (and location-less ones) into the Barcode client as available totes to scan.</w:t>
+              <w:t>A package's quants carry lot_id; delivery/return are verified per serial/lot. Basis for D-03/D-05.</w:t>
             </w:r>
           </w:p>
         </w:tc>
@@ -412,7 +992,7 @@
           </w:tcPr>
           <w:p>
             <w:r>
-              <w:t>A "kit" product explodes into components on delivery (mrp). This is the same idea as our rental_set; we already have sets, so no need to switch.</w:t>
+              <w:t>Explodes a product into components on delivery — same idea as our sets; no need to switch.</w:t>
             </w:r>
           </w:p>
         </w:tc>
@@ -434,29 +1014,7 @@
           </w:tcPr>
           <w:p>
             <w:r>
-              <w:t>Odoo 19 models "sell in packs of N" as a UoM. Different concept — not used here.</w:t>
-            </w:r>
-          </w:p>
-        </w:tc>
-      </w:tr>
-      <w:tr>
-        <w:tc>
-          <w:tcPr>
-            <w:tcW w:type="dxa" w:w="4320"/>
-          </w:tcPr>
-          <w:p>
-            <w:r>
-              <w:t>Batch / cluster picking</w:t>
-            </w:r>
-          </w:p>
-        </w:tc>
-        <w:tc>
-          <w:tcPr>
-            <w:tcW w:type="dxa" w:w="4320"/>
-          </w:tcPr>
-          <w:p>
-            <w:r>
-              <w:t>Native flow that uses reusable totes to consolidate picks. Confirms totes are first-class in Odoo.</w:t>
+              <w:t>"Sell in packs of N" as a UoM — different concept, not used.</w:t>
             </w:r>
           </w:p>
         </w:tc>
@@ -478,36 +1036,18 @@
           </w:tcPr>
           <w:p>
             <w:r>
-              <w:t>Odoo has no dedicated "returnable transport packaging that cycles to the customer and back". The standard, recommended way is to model the returnable container as a TRACKED/RENTED PRODUCT — which we already do (Eurobak 40).</w:t>
+              <w:t>No first-class object; standard practice is a tracked product (D-03).</w:t>
             </w:r>
           </w:p>
         </w:tc>
       </w:tr>
     </w:tbl>
     <w:p>
-      <w:r>
-        <w:rPr>
-          <w:b/>
-          <w:i w:val="0"/>
-        </w:rPr>
-        <w:t>Consequence: rental_scanning is a THIN layer. Most of "scan a package → add its contents / box freed after use" is native via reusable package types. The custom parts are: strict demand-fit with a split prompt, the set-barcode virtual package, and making sure it composes with sets.</w:t>
-      </w:r>
-    </w:p>
-    <w:p>
       <w:pPr>
         <w:pStyle w:val="Heading1"/>
       </w:pPr>
       <w:r>
-        <w:t>4. Reusable / Returnable Container Modelling</w:t>
-      </w:r>
-    </w:p>
-    <w:p>
-      <w:r>
-        <w:rPr>
-          <w:b w:val="0"/>
-          <w:i w:val="0"/>
-        </w:rPr>
-        <w:t>Two distinct objects — do not conflate them:</w:t>
+        <w:t>5. Container &amp; Returnable-Packaging Model (final)</w:t>
       </w:r>
     </w:p>
     <w:p>
@@ -515,7 +1055,7 @@
         <w:pStyle w:val="ListBullet"/>
       </w:pPr>
       <w:r>
-        <w:t>The returnable container is a PRODUCT (e.g. "Eurobak 40"): delivered to the client, held while with the client, returned and counted via the existing rental return flow. This is Odoo's standard way to handle returnable packaging and already satisfies "counted like a product" and "unavailable while at the client, available again on return".</w:t>
+        <w:t>The container is a generic stock.package; picking is reconciled against its ACTUAL contents (never a set). Contents may include serial/lot-tracked items (the crate) and untracked items (glasses).</w:t>
       </w:r>
     </w:p>
     <w:p>
@@ -523,7 +1063,31 @@
         <w:pStyle w:val="ListBullet"/>
       </w:pPr>
       <w:r>
-        <w:t>The stock.package (e.g. BAK01) is a handling LABEL/tote used in the warehouse. Give it a "reusable" package type so scanning it adds its contents and it is freed for reuse after picking. Its contents are NOT fixed — on return a client may repack differently; the tote is generic.</w:t>
+        <w:t>The returnable crate is a serial-tracked PRODUCT (Eurobak 40). Its serial is the durable, reusable identity: delivered to the client, returned, re-packed next cycle, counted like any product.</w:t>
+      </w:r>
+    </w:p>
+    <w:p>
+      <w:pPr>
+        <w:pStyle w:val="ListBullet"/>
+      </w:pPr>
+      <w:r>
+        <w:t>Option (iii): at delivery the stock.package dissolves; the crate serial + glasses go to the client as products. The physical crate (the serial) provides the "travels + reused" behaviour; no traveling-package customization is required.</w:t>
+      </w:r>
+    </w:p>
+    <w:p>
+      <w:pPr>
+        <w:pStyle w:val="ListBullet"/>
+      </w:pPr>
+      <w:r>
+        <w:t>Serial-scan is equivalent to package-scan: scanning the crate serial resolves to its current package and picks that package's actual contents.</w:t>
+      </w:r>
+    </w:p>
+    <w:p>
+      <w:pPr>
+        <w:pStyle w:val="ListBullet"/>
+      </w:pPr>
+      <w:r>
+        <w:t>Ad-hoc containers are supported alongside pre-prepared ones (native Put in Pack); same reconciliation.</w:t>
       </w:r>
     </w:p>
     <w:p>
@@ -532,139 +1096,7 @@
           <w:b w:val="0"/>
           <w:i/>
         </w:rPr>
-        <w:t>This resolves the earlier tension: the "with the client / freed only on return / counted" lifecycle belongs to the PRODUCT (Eurobak 40); the reusable TOTE is a warehouse label that is emptied and reused. No new product is required.</w:t>
-      </w:r>
-    </w:p>
-    <w:p>
-      <w:pPr>
-        <w:pStyle w:val="Heading1"/>
-      </w:pPr>
-      <w:r>
-        <w:t>5. What Happens to the Package at Customer Delivery (your question)</w:t>
-      </w:r>
-    </w:p>
-    <w:p>
-      <w:r>
-        <w:rPr>
-          <w:b w:val="0"/>
-          <w:i w:val="0"/>
-        </w:rPr>
-        <w:t>Three standard options; pick per package type:</w:t>
-      </w:r>
-    </w:p>
-    <w:tbl>
-      <w:tblPr>
-        <w:tblStyle w:val="LightGrid-Accent1"/>
-        <w:tblW w:type="auto" w:w="0"/>
-        <w:jc w:val="center"/>
-        <w:tblLook w:firstColumn="1" w:firstRow="1" w:lastColumn="0" w:lastRow="0" w:noHBand="0" w:noVBand="1" w:val="04A0"/>
-      </w:tblPr>
-      <w:tblGrid>
-        <w:gridCol w:w="4320"/>
-        <w:gridCol w:w="4320"/>
-      </w:tblGrid>
-      <w:tr>
-        <w:tc>
-          <w:tcPr>
-            <w:tcW w:type="dxa" w:w="4320"/>
-          </w:tcPr>
-          <w:p>
-            <w:r>
-              <w:rPr>
-                <w:b/>
-              </w:rPr>
-              <w:t>Option</w:t>
-            </w:r>
-          </w:p>
-        </w:tc>
-        <w:tc>
-          <w:tcPr>
-            <w:tcW w:type="dxa" w:w="4320"/>
-          </w:tcPr>
-          <w:p>
-            <w:r>
-              <w:rPr>
-                <w:b/>
-              </w:rPr>
-              <w:t>Behaviour</w:t>
-            </w:r>
-          </w:p>
-        </w:tc>
-      </w:tr>
-      <w:tr>
-        <w:tc>
-          <w:tcPr>
-            <w:tcW w:type="dxa" w:w="4320"/>
-          </w:tcPr>
-          <w:p>
-            <w:r>
-              <w:t>(i) Dissolve</w:t>
-            </w:r>
-          </w:p>
-        </w:tc>
-        <w:tc>
-          <w:tcPr>
-            <w:tcW w:type="dxa" w:w="4320"/>
-          </w:tcPr>
-          <w:p>
-            <w:r>
-              <w:t>Goods delivered loose, package emptied and the label freed immediately. Native for reusable totes (box stays in the warehouse, never goes to the customer).</w:t>
-            </w:r>
-          </w:p>
-        </w:tc>
-      </w:tr>
-      <w:tr>
-        <w:tc>
-          <w:tcPr>
-            <w:tcW w:type="dxa" w:w="4320"/>
-          </w:tcPr>
-          <w:p>
-            <w:r>
-              <w:t>(ii) Travel with goods</w:t>
-            </w:r>
-          </w:p>
-        </w:tc>
-        <w:tc>
-          <w:tcPr>
-            <w:tcW w:type="dxa" w:w="4320"/>
-          </w:tcPr>
-          <w:p>
-            <w:r>
-              <w:t>The package becomes result_package and physically goes to the customer (native for DISPOSABLE boxes). The label is "occupied" while at the client and only freed when the goods return. This matches PPB-10 if you want the box to leave the warehouse.</w:t>
-            </w:r>
-          </w:p>
-        </w:tc>
-      </w:tr>
-      <w:tr>
-        <w:tc>
-          <w:tcPr>
-            <w:tcW w:type="dxa" w:w="4320"/>
-          </w:tcPr>
-          <w:p>
-            <w:r>
-              <w:t>(iii) Container = product</w:t>
-            </w:r>
-          </w:p>
-        </w:tc>
-        <w:tc>
-          <w:tcPr>
-            <w:tcW w:type="dxa" w:w="4320"/>
-          </w:tcPr>
-          <w:p>
-            <w:r>
-              <w:t>The returnable container is a product (Eurobak 40) that travels and returns; the stock.package label is only a warehouse grouping and can dissolve (i). RECOMMENDED.</w:t>
-            </w:r>
-          </w:p>
-        </w:tc>
-      </w:tr>
-    </w:tbl>
-    <w:p>
-      <w:r>
-        <w:rPr>
-          <w:b/>
-          <w:i w:val="0"/>
-        </w:rPr>
-        <w:t>Recommendation: Option (iii) — the returnable semantics live on the PRODUCT; the tote is reusable and warehouse-side. If instead you want the physical label itself to leave with the client and return, use Option (ii) with a disposable box type.</w:t>
+        <w:t>Caveats (accepted): serial-scan only behaves as a "container" while the crate is actually packed; container-at-customer traceability is via the delivery record + serial, not a live package object; glasses are fungible so their return is verified by count while the crate is verified per-serial.</w:t>
       </w:r>
     </w:p>
     <w:p>
@@ -755,7 +1187,7 @@
           </w:tcPr>
           <w:p>
             <w:r>
-              <w:t>On any picking the user can scan a package barcode (Barcode app) or select it via a backend action to assign it. Reusable package types make scan-adds-contents native; this requirement layers the rules below on top.</w:t>
+              <w:t>On any picking, the user can scan a package barcode (Barcode app) or select it via a backend action to assign it. Native reusable package types make scan-adds-contents work; the rules below are layered on top.</w:t>
             </w:r>
           </w:p>
         </w:tc>
@@ -787,7 +1219,7 @@
           </w:tcPr>
           <w:p>
             <w:r>
-              <w:t>A package is eligible only if it is in (a sublocation of) the picking's source location — the same rule as normal picking, for ALL locations (WH/Stock was only an example). A package that "looks like a location" is picked when its location is the (pre)selected source.</w:t>
+              <w:t>A package is eligible only if it is in (a sublocation of) the picking's source location — same rule as normal picking, for ALL locations.</w:t>
             </w:r>
           </w:p>
         </w:tc>
@@ -809,7 +1241,7 @@
           </w:tcPr>
           <w:p>
             <w:r>
-              <w:t>Reconcile demand</w:t>
+              <w:t>Reconcile actual contents</w:t>
             </w:r>
           </w:p>
         </w:tc>
@@ -819,7 +1251,7 @@
           </w:tcPr>
           <w:p>
             <w:r>
-              <w:t>For each product in the package matching an OPEN demand, fill the move-line done-qty from the package and stamp the source package. Never create demand-0 lines.</w:t>
+              <w:t>For each product in the package that matches an OPEN demand, fill the move-line done-qty from the package and stamp the source package (and its lot/serial for tracked items). Never create demand-0 lines. Reconcile by ACTUAL contents, never an inferred set.</w:t>
             </w:r>
           </w:p>
         </w:tc>
@@ -851,7 +1283,7 @@
           </w:tcPr>
           <w:p>
             <w:r>
-              <w:t>The scan never exceeds demand silently (fixes the "demand 0 / 40 / 80" doubling seen earlier).</w:t>
+              <w:t>The scan never exceeds demand silently (fixes the "demand 0 / 40 / 80" doubling).</w:t>
             </w:r>
           </w:p>
         </w:tc>
@@ -883,7 +1315,7 @@
           </w:tcPr>
           <w:p>
             <w:r>
-              <w:t>Accepted when every product+qty in the package fits within the remaining demand. If EXTRA stock is genuinely required, the picker must MANUALLY ADD a line for it (so adding extra is possible, but explicit — never automatic from the package).</w:t>
+              <w:t>Accepted when every product+qty fits within remaining demand. If extra stock is genuinely required, the picker adds a line MANUALLY (explicit, never auto-pulled).</w:t>
             </w:r>
           </w:p>
         </w:tc>
@@ -915,7 +1347,7 @@
           </w:tcPr>
           <w:p>
             <w:r>
-              <w:t>If the package holds MORE of a product than is needed, do not hard-fail: ASK the order picker whether they want to split the package. If yes, consume up to demand and leave the remainder in (a) the package; if no, reject the scan. Splitting is real physical work, so it is an explicit, acknowledged action.</w:t>
+              <w:t>If the package holds MORE of a product than needed, prompt the picker to split: yes = consume up to demand and keep the remainder; no = reject. Splitting is real physical work and must be acknowledged.</w:t>
             </w:r>
           </w:p>
         </w:tc>
@@ -979,7 +1411,7 @@
           </w:tcPr>
           <w:p>
             <w:r>
-              <w:t>The zero-demand set header produces no barcode line and never blocks validation (Validate → button_validate, where _sanity_check neutralises it).</w:t>
+              <w:t>The zero-demand set header produces no barcode line and never blocks validation (Validate -&gt; button_validate, where _sanity_check neutralises it).</w:t>
             </w:r>
           </w:p>
         </w:tc>
@@ -1011,7 +1443,7 @@
           </w:tcPr>
           <w:p>
             <w:r>
-              <w:t>Works on ANY warehouse operation — outbound, internal AND inbound. e.g. on inbound it can be a step to regroup returned products into packages before moving to stock. Not gated by operation type.</w:t>
+              <w:t>Works on outbound, internal AND inbound operations (e.g. regroup returned products into packages before moving to stock). Not gated by operation type.</w:t>
             </w:r>
           </w:p>
         </w:tc>
@@ -1033,7 +1465,7 @@
           </w:tcPr>
           <w:p>
             <w:r>
-              <w:t>Container lifecycle</w:t>
+              <w:t>Container lifecycle (Option iii)</w:t>
             </w:r>
           </w:p>
         </w:tc>
@@ -1043,7 +1475,7 @@
           </w:tcPr>
           <w:p>
             <w:r>
-              <w:t>With a reusable tote (Option iii) the tote is freed after picking; the returnable CONTAINER (product) is unavailable while at the client and freed/counted on return. If Option (ii) is chosen, the package label is freed only upon return.</w:t>
+              <w:t>The stock.package is warehouse-internal and dissolves at delivery. The serial-tracked container PRODUCT is the reusable, durable identity: delivered, returned, re-packed next cycle. Return verifies the crate per-serial and glasses by count.</w:t>
             </w:r>
           </w:p>
         </w:tc>
@@ -1097,7 +1529,7 @@
           </w:tcPr>
           <w:p>
             <w:r>
-              <w:t>Set barcode (virtual package)</w:t>
+              <w:t>Set barcode (definition-driven)</w:t>
             </w:r>
           </w:p>
         </w:tc>
@@ -1107,7 +1539,7 @@
           </w:tcPr>
           <w:p>
             <w:r>
-              <w:t>A barcode can be assigned to a SET. Scanning it behaves as if a package containing exactly the set's components were picked: it fills the set's component demand (capped, with the same PPB-05/06 rules). No physical package needed — the set definition acts as the "expected contents".</w:t>
+              <w:t>A barcode can be assigned to a SET; scanning it fills the set's DEFINED components (capped, with PPB-05/06 rules). No physical package needed. Separate from the container scan; does not pin specific serials.</w:t>
             </w:r>
           </w:p>
         </w:tc>
@@ -1129,6 +1561,38 @@
           </w:tcPr>
           <w:p>
             <w:r>
+              <w:t>Serial-scan -&gt; container</w:t>
+            </w:r>
+          </w:p>
+        </w:tc>
+        <w:tc>
+          <w:tcPr>
+            <w:tcW w:type="dxa" w:w="2880"/>
+          </w:tcPr>
+          <w:p>
+            <w:r>
+              <w:t>Scanning a tracked content's serial resolves to the package that currently holds it and picks that package's ACTUAL contents — the same result as scanning the package barcode.</w:t>
+            </w:r>
+          </w:p>
+        </w:tc>
+      </w:tr>
+      <w:tr>
+        <w:tc>
+          <w:tcPr>
+            <w:tcW w:type="dxa" w:w="2880"/>
+          </w:tcPr>
+          <w:p>
+            <w:r>
+              <w:t>PPB-14</w:t>
+            </w:r>
+          </w:p>
+        </w:tc>
+        <w:tc>
+          <w:tcPr>
+            <w:tcW w:type="dxa" w:w="2880"/>
+          </w:tcPr>
+          <w:p>
+            <w:r>
               <w:t>Multilingual</w:t>
             </w:r>
           </w:p>
@@ -1139,7 +1603,7 @@
           </w:tcPr>
           <w:p>
             <w:r>
-              <w:t>All user-facing strings (errors, the split prompt, action labels) are translatable; Dutch (nl) and French (fr) translations are shipped alongside the English source.</w:t>
+              <w:t>All user-facing strings (errors, split prompt, action labels) are translatable; Dutch (nl) and French (fr) translations ship with the English source.</w:t>
             </w:r>
           </w:p>
         </w:tc>
@@ -1158,7 +1622,7 @@
         <w:pStyle w:val="ListNumber"/>
       </w:pPr>
       <w:r>
-        <w:t>Resolve the scanned package/set-barcode; verify PPB-02 (location). If ineligible → reject.</w:t>
+        <w:t>Resolve the scanned barcode: a package -&gt; that package; a content serial -&gt; the package holding it (PPB-13); a set barcode -&gt; the set's defined components (PPB-12). Verify PPB-02 location.</w:t>
       </w:r>
     </w:p>
     <w:p>
@@ -1166,7 +1630,7 @@
         <w:pStyle w:val="ListNumber"/>
       </w:pPr>
       <w:r>
-        <w:t>Read contents as product→qty (package contents, or the set's component quantities for PPB-12).</w:t>
+        <w:t>Read contents as product -&gt; qty (actual package contents, or set components for PPB-12), including lot/serial for tracked items.</w:t>
       </w:r>
     </w:p>
     <w:p>
@@ -1182,7 +1646,7 @@
         <w:pStyle w:val="ListNumber"/>
       </w:pPr>
       <w:r>
-        <w:t>For each product: if package_qty ≤ remaining_demand → apply (fill move-line, cap at demand, stamp source package). If a product is not demanded at all → reject with a clear message (PPB-05 says add it manually if truly needed).</w:t>
+        <w:t>For each product: if package_qty &lt;= remaining_demand -&gt; apply (fill move-line, cap at demand, stamp source package + lot/serial). If a product is not demanded at all -&gt; reject with a clear message (add manually per PPB-05 if truly needed).</w:t>
       </w:r>
     </w:p>
     <w:p>
@@ -1190,7 +1654,7 @@
         <w:pStyle w:val="ListNumber"/>
       </w:pPr>
       <w:r>
-        <w:t>If package_qty &gt; remaining_demand for some product → prompt "split the package?" (PPB-06): yes = consume up to demand and keep the remainder; no = reject.</w:t>
+        <w:t>If package_qty &gt; remaining_demand for some product -&gt; prompt "split the package?" (PPB-06).</w:t>
       </w:r>
     </w:p>
     <w:p>
@@ -1289,7 +1753,7 @@
           </w:tcPr>
           <w:p>
             <w:r>
-              <w:t>Package = exact demand → fills all moves, no overflow, validates.</w:t>
+              <w:t>Package = exact demand -&gt; fills all moves, no overflow, validates.</w:t>
             </w:r>
           </w:p>
         </w:tc>
@@ -1321,7 +1785,7 @@
           </w:tcPr>
           <w:p>
             <w:r>
-              <w:t>Same on Pick→Pack→Ship → works each step.</w:t>
+              <w:t>Same on Pick-&gt;Pack-&gt;Ship -&gt; works each step.</w:t>
             </w:r>
           </w:p>
         </w:tc>
@@ -1353,7 +1817,7 @@
           </w:tcPr>
           <w:p>
             <w:r>
-              <w:t>Package has a product not demanded → scan rejected; picker may add a line manually.</w:t>
+              <w:t>Package has a product not demanded -&gt; rejected; picker may add a line manually.</w:t>
             </w:r>
           </w:p>
         </w:tc>
@@ -1375,7 +1839,7 @@
           </w:tcPr>
           <w:p>
             <w:r>
-              <w:t>Quantity overflow → split prompt</w:t>
+              <w:t>Quantity overflow -&gt; split prompt</w:t>
             </w:r>
           </w:p>
         </w:tc>
@@ -1385,7 +1849,7 @@
           </w:tcPr>
           <w:p>
             <w:r>
-              <w:t>More of a product than needed → picker is asked to split; yes consumes up to demand, no rejects.</w:t>
+              <w:t>More of a product than needed -&gt; picker asked to split.</w:t>
             </w:r>
           </w:p>
         </w:tc>
@@ -1417,7 +1881,7 @@
           </w:tcPr>
           <w:p>
             <w:r>
-              <w:t>Fewer than demanded → accepted, remainder open.</w:t>
+              <w:t>Fewer than demanded -&gt; accepted, remainder open.</w:t>
             </w:r>
           </w:p>
         </w:tc>
@@ -1449,7 +1913,7 @@
           </w:tcPr>
           <w:p>
             <w:r>
-              <w:t>Package outside the picking source → ineligible.</w:t>
+              <w:t>Package outside the picking source -&gt; ineligible.</w:t>
             </w:r>
           </w:p>
         </w:tc>
@@ -1513,7 +1977,7 @@
           </w:tcPr>
           <w:p>
             <w:r>
-              <w:t>On an inbound/internal operation, scanning regroups products into a package.</w:t>
+              <w:t>On inbound/internal, scanning regroups products into a package.</w:t>
             </w:r>
           </w:p>
         </w:tc>
@@ -1545,7 +2009,7 @@
           </w:tcPr>
           <w:p>
             <w:r>
-              <w:t>Scanning a set barcode fills the set's component demand (PPB-12).</w:t>
+              <w:t>Scanning a set barcode fills the set's defined components (PPB-12).</w:t>
             </w:r>
           </w:p>
         </w:tc>
@@ -1567,7 +2031,7 @@
           </w:tcPr>
           <w:p>
             <w:r>
-              <w:t>Reusable tote freed</w:t>
+              <w:t>Serial-scan -&gt; container</w:t>
             </w:r>
           </w:p>
         </w:tc>
@@ -1577,7 +2041,7 @@
           </w:tcPr>
           <w:p>
             <w:r>
-              <w:t>After picking, a reusable tote is emptied/freed; a returnable container product is counted on return.</w:t>
+              <w:t>Scanning a crate serial picks its current package's contents (PPB-13).</w:t>
             </w:r>
           </w:p>
         </w:tc>
@@ -1590,6 +2054,38 @@
           <w:p>
             <w:r>
               <w:t>T-11</w:t>
+            </w:r>
+          </w:p>
+        </w:tc>
+        <w:tc>
+          <w:tcPr>
+            <w:tcW w:type="dxa" w:w="2880"/>
+          </w:tcPr>
+          <w:p>
+            <w:r>
+              <w:t>Serial delivery/return</w:t>
+            </w:r>
+          </w:p>
+        </w:tc>
+        <w:tc>
+          <w:tcPr>
+            <w:tcW w:type="dxa" w:w="2880"/>
+          </w:tcPr>
+          <w:p>
+            <w:r>
+              <w:t>Crate serial recorded on delivery; return reconciles serial back + glasses by count.</w:t>
+            </w:r>
+          </w:p>
+        </w:tc>
+      </w:tr>
+      <w:tr>
+        <w:tc>
+          <w:tcPr>
+            <w:tcW w:type="dxa" w:w="2880"/>
+          </w:tcPr>
+          <w:p>
+            <w:r>
+              <w:t>T-12</w:t>
             </w:r>
           </w:p>
         </w:tc>
@@ -1621,7 +2117,7 @@
           <w:b w:val="0"/>
           <w:i/>
         </w:rPr>
-        <w:t>Today's suite has no physical-package coverage; T-01..T-11 add it.</w:t>
+        <w:t>Today's suite has no physical-package coverage; T-01..T-12 add it.</w:t>
       </w:r>
     </w:p>
     <w:p>
@@ -1637,7 +2133,7 @@
         <w:pStyle w:val="ListBullet"/>
       </w:pPr>
       <w:r>
-        <w:t>Single module rental_scanning, depending only on stock_barcode (+ composes with rental_set). It is the home for all future scanning work.</w:t>
+        <w:t>Single module rental_scanning, depending only on stock_barcode (+ composes with rental_set). Home for all future scanning work.</w:t>
       </w:r>
     </w:p>
     <w:p>
@@ -1645,7 +2141,7 @@
         <w:pStyle w:val="ListBullet"/>
       </w:pPr>
       <w:r>
-        <w:t>Reuse native reusable package types for scan-adds-contents and box-freeing; the module adds only the strict-fit rules, the split prompt, the set barcode, and set composition.</w:t>
+        <w:t>Reuse native reusable package types for scan-adds-contents and box freeing; the module adds the strict-fit rules, the split prompt, serial-scan resolution, the set barcode, and set composition.</w:t>
       </w:r>
     </w:p>
     <w:p>
@@ -1661,7 +2157,16 @@
         <w:pStyle w:val="Heading1"/>
       </w:pPr>
       <w:r>
-        <w:t>10. Scope Boundaries &amp; Open Items</w:t>
+        <w:t>10. Scope Boundaries</w:t>
+      </w:r>
+    </w:p>
+    <w:p>
+      <w:r>
+        <w:rPr>
+          <w:b/>
+          <w:i w:val="0"/>
+        </w:rPr>
+        <w:t>In scope:</w:t>
       </w:r>
     </w:p>
     <w:p>
@@ -1669,7 +2174,7 @@
         <w:pStyle w:val="ListBullet"/>
       </w:pPr>
       <w:r>
-        <w:t>Out of scope: automated kitting build, auto-reservation of a matching package, Sales/Website/Kiosk visibility, a new product for the package.</w:t>
+        <w:t>Manual scan/assign of a package (or crate serial, or set barcode) on any operation.</w:t>
       </w:r>
     </w:p>
     <w:p>
@@ -1677,7 +2182,7 @@
         <w:pStyle w:val="ListBullet"/>
       </w:pPr>
       <w:r>
-        <w:t>"Reusable-label metadata" (from v1) meant a custom field on a package to record "the set it usually holds". This is now DROPPED — native reusable package types + PPB-12 cover it; packages stay generic.</w:t>
+        <w:t>Strict-fit reconciliation with split prompt; serial/lot handling; multilingual.</w:t>
       </w:r>
     </w:p>
     <w:p>
@@ -1685,7 +2190,64 @@
         <w:pStyle w:val="ListBullet"/>
       </w:pPr>
       <w:r>
-        <w:t>Decision needed: Option (ii) vs (iii) for whether the physical label leaves with the client (recommended: iii).</w:t>
+        <w:t>All routes; set-header no-op; ad-hoc and pre-prepared containers.</w:t>
+      </w:r>
+    </w:p>
+    <w:p>
+      <w:r>
+        <w:rPr>
+          <w:b/>
+          <w:i w:val="0"/>
+        </w:rPr>
+        <w:t>Out of scope (with reason):</w:t>
+      </w:r>
+    </w:p>
+    <w:p>
+      <w:pPr>
+        <w:pStyle w:val="ListBullet"/>
+      </w:pPr>
+      <w:r>
+        <w:t>Automated kitting/preparation build — done manually to keep scope limited.</w:t>
+      </w:r>
+    </w:p>
+    <w:p>
+      <w:pPr>
+        <w:pStyle w:val="ListBullet"/>
+      </w:pPr>
+      <w:r>
+        <w:t>Auto-reservation of a matching package (Option B) — deferred; heavy matching logic.</w:t>
+      </w:r>
+    </w:p>
+    <w:p>
+      <w:pPr>
+        <w:pStyle w:val="ListBullet"/>
+      </w:pPr>
+      <w:r>
+        <w:t>Sales/Website/Kiosk visibility — this is a warehouse-only concept.</w:t>
+      </w:r>
+    </w:p>
+    <w:p>
+      <w:pPr>
+        <w:pStyle w:val="ListBullet"/>
+      </w:pPr>
+      <w:r>
+        <w:t>A new product for the package, or package-ID=serial coupling — rejected (D-03).</w:t>
+      </w:r>
+    </w:p>
+    <w:p>
+      <w:pPr>
+        <w:pStyle w:val="ListBullet"/>
+      </w:pPr>
+      <w:r>
+        <w:t>A custom reusable-label metadata field — rejected (D-11); native types suffice.</w:t>
+      </w:r>
+    </w:p>
+    <w:p>
+      <w:pPr>
+        <w:pStyle w:val="ListBullet"/>
+      </w:pPr>
+      <w:r>
+        <w:t>Making a package physically travel (Option ii) — rejected (D-04) in favour of the serial.</w:t>
       </w:r>
     </w:p>
     <w:sectPr>

</xml_diff>

<commit_message>
docs: expand Rental Scanning requirements (v4) with per-option pros/cons
Rework section 4 into per-decision subsections, each listing the options
with explicit Pros/Cons plus the decision & rationale (binding, contents
vs set-inference, container modelling, delivery i/ii/iii incl ii-a/ii-b,
overflow handling, operation-type scope, module placement, reusable
identification). Add Background & Root-Cause, a Technical Findings
appendix, and existing test-suite coverage gaps.

Co-Authored-By: Claude Opus 4.8 <noreply@anthropic.com>
Claude-Session: https://claude.ai/code/session_015UyktmijNHjiCtQB359rzX
</commit_message>
<xml_diff>
--- a/docs/rental_scanning_requirements.docx
+++ b/docs/rental_scanning_requirements.docx
@@ -18,7 +18,7 @@
           <w:color w:val="1F497D"/>
           <w:sz w:val="26"/>
         </w:rPr>
-        <w:t>Functional &amp; Technical Requirements — Backend / Inventory + Barcode (v3, FINAL)</w:t>
+        <w:t>Functional &amp; Technical Requirements — Backend / Inventory + Barcode (v4, FINAL)</w:t>
       </w:r>
     </w:p>
     <w:tbl>
@@ -246,7 +246,7 @@
           <w:b w:val="0"/>
           <w:i w:val="0"/>
         </w:rPr>
-        <w:t>Warehouse staff prepare sets (combined products) into physical packages ahead of orders to speed up picking. Which prepared package serves which order is decided only at pick time ("late binding"), by manually scanning or selecting the package on the operation. This document specifies that behaviour and records WHY each decision was taken. Preparation (building packages) is done manually with standard Odoo tools.</w:t>
+        <w:t>Warehouse staff prepare sets (combined products) into physical packages ahead of orders to speed up picking. Which prepared package serves which order is decided only at pick time ("late binding"), by manually scanning or selecting the package. This document specifies the behaviour, the technical background that motivated it, and — in full — WHY each option was chosen or rejected. Preparation (building packages) is done manually with standard Odoo tools.</w:t>
       </w:r>
     </w:p>
     <w:p>
@@ -254,31 +254,7 @@
         <w:pStyle w:val="Heading1"/>
       </w:pPr>
       <w:r>
-        <w:t>2. Confirmations (verified in code)</w:t>
-      </w:r>
-    </w:p>
-    <w:p>
-      <w:pPr>
-        <w:pStyle w:val="ListBullet"/>
-      </w:pPr>
-      <w:r>
-        <w:t>Multi-step routes: the rental-set logic is NOT gated by operation type. Grouping, the "[Set] Product" prefix, indentation and the zero-demand header work identically on Pick, Pack, Ship and single-step Delivery. (Keys off "outbound sale chain": sale_id set AND return_id not set.)</w:t>
-      </w:r>
-    </w:p>
-    <w:p>
-      <w:pPr>
-        <w:pStyle w:val="ListBullet"/>
-      </w:pPr>
-      <w:r>
-        <w:t>Set header disappears at the client: grouping and the header show ONLY on the outbound sale chain. Return pickings (return_id set) show NO header and NO prefix, because the warehouse cannot control how the client returns goods. So once goods reach the client and come back, the set-header is gone and items return as plain products. (Verified in _compute_rental_set_show_grouping and _compute_description_picking.)</w:t>
-      </w:r>
-    </w:p>
-    <w:p>
-      <w:pPr>
-        <w:pStyle w:val="Heading1"/>
-      </w:pPr>
-      <w:r>
-        <w:t>3. Design Decisions &amp; Rationale</w:t>
+        <w:t>2. Background &amp; Root-Cause (why this work exists)</w:t>
       </w:r>
     </w:p>
     <w:p>
@@ -287,7 +263,1285 @@
           <w:b w:val="0"/>
           <w:i w:val="0"/>
         </w:rPr>
-        <w:t>This section records what was chosen, what was rejected, and why — for future maintainers.</w:t>
+        <w:t>The feature grew out of a real defect: scanning / moving a physical package on a set delivery produced phantom quantities ("40 with demand 0", earlier "80"). Root cause, established by reading the records and the code:</w:t>
+      </w:r>
+    </w:p>
+    <w:p>
+      <w:pPr>
+        <w:pStyle w:val="ListBullet"/>
+      </w:pPr>
+      <w:r>
+        <w:t>The picking reserved LOOSE stock, not the package. The reserved move-lines carried no package_id, while the package's quants were unreserved.</w:t>
+      </w:r>
+    </w:p>
+    <w:p>
+      <w:pPr>
+        <w:pStyle w:val="ListBullet"/>
+      </w:pPr>
+      <w:r>
+        <w:t>The operation type had "Move Entire Packages" (show_entire_packs) = False, so the package was not treated as a movable unit.</w:t>
+      </w:r>
+    </w:p>
+    <w:p>
+      <w:pPr>
+        <w:pStyle w:val="ListBullet"/>
+      </w:pPr>
+      <w:r>
+        <w:t>The barcode routine _processPackage, finding no move-lines already linked to the scanned package, falls through to "create a line per quant" — adding NEW lines for the package contents ON TOP of the loose reservation. Result: doubling / demand-0 overflow.</w:t>
+      </w:r>
+    </w:p>
+    <w:p>
+      <w:pPr>
+        <w:pStyle w:val="ListBullet"/>
+      </w:pPr>
+      <w:r>
+        <w:t>Separately confirmed NOT to be the cause: the rental-set logic is not gated by operation type (it works on all outbound steps), and the zero-demand set header is barcode-safe (it has no move-line, so it produces no barcode line and never blocks button_validate, where the rental_set _sanity_check override neutralises it).</w:t>
+      </w:r>
+    </w:p>
+    <w:p>
+      <w:r>
+        <w:rPr>
+          <w:b/>
+          <w:i w:val="0"/>
+        </w:rPr>
+        <w:t>Conclusion: the fix is to reconcile a scanned package against EXISTING demand (never create overflow), and to build the "prepared package / set scan" flow on top of that. Hence rental_scanning.</w:t>
+      </w:r>
+    </w:p>
+    <w:p>
+      <w:pPr>
+        <w:pStyle w:val="Heading1"/>
+      </w:pPr>
+      <w:r>
+        <w:t>3. Confirmations (verified in code)</w:t>
+      </w:r>
+    </w:p>
+    <w:p>
+      <w:pPr>
+        <w:pStyle w:val="ListBullet"/>
+      </w:pPr>
+      <w:r>
+        <w:t>Multi-step routes: rental-set grouping, the "[Set] Product" prefix, indentation and the zero-demand header work identically on Pick, Pack, Ship and single-step Delivery (keys off "outbound sale chain": sale_id set AND return_id not set — no per-operation-type branch).</w:t>
+      </w:r>
+    </w:p>
+    <w:p>
+      <w:pPr>
+        <w:pStyle w:val="ListBullet"/>
+      </w:pPr>
+      <w:r>
+        <w:t>Set header disappears at the client: grouping/header show ONLY on the outbound sale chain; return pickings (return_id set) show NO header and NO prefix. So once goods reach the client and come back, the header is gone and items return as plain products.</w:t>
+      </w:r>
+    </w:p>
+    <w:p>
+      <w:pPr>
+        <w:pStyle w:val="Heading1"/>
+      </w:pPr>
+      <w:r>
+        <w:t>4. Design Decisions — Options, Pros/Cons &amp; Rationale</w:t>
+      </w:r>
+    </w:p>
+    <w:p>
+      <w:pPr>
+        <w:pStyle w:val="Heading2"/>
+      </w:pPr>
+      <w:r>
+        <w:t>4.1 Binding &amp; selection: manual late binding vs automatic reservation</w:t>
+      </w:r>
+    </w:p>
+    <w:p>
+      <w:r>
+        <w:rPr>
+          <w:b/>
+          <w:i w:val="0"/>
+        </w:rPr>
+        <w:t>Option A — Manual late binding (scan/select at pick time)</w:t>
+      </w:r>
+    </w:p>
+    <w:p>
+      <w:r>
+        <w:rPr>
+          <w:b w:val="0"/>
+          <w:i/>
+        </w:rPr>
+        <w:t>Pros:</w:t>
+      </w:r>
+    </w:p>
+    <w:p>
+      <w:pPr>
+        <w:pStyle w:val="ListBullet"/>
+      </w:pPr>
+      <w:r>
+        <w:t>Closest to Odoo standard; the picker decides at the moment of picking.</w:t>
+      </w:r>
+    </w:p>
+    <w:p>
+      <w:pPr>
+        <w:pStyle w:val="ListBullet"/>
+      </w:pPr>
+      <w:r>
+        <w:t>No need to know in advance which package serves which order.</w:t>
+      </w:r>
+    </w:p>
+    <w:p>
+      <w:pPr>
+        <w:pStyle w:val="ListBullet"/>
+      </w:pPr>
+      <w:r>
+        <w:t>Robust to varying package contents; simple and predictable.</w:t>
+      </w:r>
+    </w:p>
+    <w:p>
+      <w:r>
+        <w:rPr>
+          <w:b w:val="0"/>
+          <w:i/>
+        </w:rPr>
+        <w:t>Cons:</w:t>
+      </w:r>
+    </w:p>
+    <w:p>
+      <w:pPr>
+        <w:pStyle w:val="ListBullet"/>
+      </w:pPr>
+      <w:r>
+        <w:t>Relies on the picker to grab an appropriate package (no automatic optimisation).</w:t>
+      </w:r>
+    </w:p>
+    <w:p>
+      <w:r>
+        <w:rPr>
+          <w:b/>
+          <w:i w:val="0"/>
+        </w:rPr>
+        <w:t>Option B — Automatically reserve a matching package</w:t>
+      </w:r>
+    </w:p>
+    <w:p>
+      <w:r>
+        <w:rPr>
+          <w:b w:val="0"/>
+          <w:i/>
+        </w:rPr>
+        <w:t>Pros:</w:t>
+      </w:r>
+    </w:p>
+    <w:p>
+      <w:pPr>
+        <w:pStyle w:val="ListBullet"/>
+      </w:pPr>
+      <w:r>
+        <w:t>Less picker decision-making; potential optimisation.</w:t>
+      </w:r>
+    </w:p>
+    <w:p>
+      <w:r>
+        <w:rPr>
+          <w:b w:val="0"/>
+          <w:i/>
+        </w:rPr>
+        <w:t>Cons:</w:t>
+      </w:r>
+    </w:p>
+    <w:p>
+      <w:pPr>
+        <w:pStyle w:val="ListBullet"/>
+      </w:pPr>
+      <w:r>
+        <w:t>Heavy matching logic (which package matches which demand/set).</w:t>
+      </w:r>
+    </w:p>
+    <w:p>
+      <w:pPr>
+        <w:pStyle w:val="ListBullet"/>
+      </w:pPr>
+      <w:r>
+        <w:t>Many edge cases: partial packages, competing orders, varying contents.</w:t>
+      </w:r>
+    </w:p>
+    <w:p>
+      <w:pPr>
+        <w:pStyle w:val="ListBullet"/>
+      </w:pPr>
+      <w:r>
+        <w:t>Reservation-time binding contradicts "we do not know which package serves which order".</w:t>
+      </w:r>
+    </w:p>
+    <w:p>
+      <w:r>
+        <w:rPr>
+          <w:b/>
+          <w:color w:val="1F497D"/>
+        </w:rPr>
+        <w:t xml:space="preserve">Decision &amp; rationale: </w:t>
+      </w:r>
+      <w:r>
+        <w:t>Option A. Option B is deferred and can be layered on later; the matching complexity is not justified now.</w:t>
+      </w:r>
+    </w:p>
+    <w:p>
+      <w:pPr>
+        <w:pStyle w:val="Heading2"/>
+      </w:pPr>
+      <w:r>
+        <w:t>4.2 What defines the pick: actual package contents vs inferring a set from the container</w:t>
+      </w:r>
+    </w:p>
+    <w:p>
+      <w:r>
+        <w:rPr>
+          <w:b/>
+          <w:i w:val="0"/>
+        </w:rPr>
+        <w:t>Actual package contents (read the real quants)</w:t>
+      </w:r>
+    </w:p>
+    <w:p>
+      <w:r>
+        <w:rPr>
+          <w:b w:val="0"/>
+          <w:i/>
+        </w:rPr>
+        <w:t>Pros:</w:t>
+      </w:r>
+    </w:p>
+    <w:p>
+      <w:pPr>
+        <w:pStyle w:val="ListBullet"/>
+      </w:pPr>
+      <w:r>
+        <w:t>Truthful when contents vary (40 glasses today, 40 plates tomorrow).</w:t>
+      </w:r>
+    </w:p>
+    <w:p>
+      <w:pPr>
+        <w:pStyle w:val="ListBullet"/>
+      </w:pPr>
+      <w:r>
+        <w:t>Native — a package's quants (incl. lot/serial) are authoritative.</w:t>
+      </w:r>
+    </w:p>
+    <w:p>
+      <w:pPr>
+        <w:pStyle w:val="ListBullet"/>
+      </w:pPr>
+      <w:r>
+        <w:t>No stale assumptions to maintain.</w:t>
+      </w:r>
+    </w:p>
+    <w:p>
+      <w:r>
+        <w:rPr>
+          <w:b w:val="0"/>
+          <w:i/>
+        </w:rPr>
+        <w:t>Cons:</w:t>
+      </w:r>
+    </w:p>
+    <w:p>
+      <w:pPr>
+        <w:pStyle w:val="ListBullet"/>
+      </w:pPr>
+      <w:r>
+        <w:t>Must read and reconcile live contents; a non-matching package needs handling (split/reject).</w:t>
+      </w:r>
+    </w:p>
+    <w:p>
+      <w:r>
+        <w:rPr>
+          <w:b/>
+          <w:i w:val="0"/>
+        </w:rPr>
+        <w:t>Infer contents/"the set" from the container or its crate serial (old "Approach B")</w:t>
+      </w:r>
+    </w:p>
+    <w:p>
+      <w:r>
+        <w:rPr>
+          <w:b w:val="0"/>
+          <w:i/>
+        </w:rPr>
+        <w:t>Pros:</w:t>
+      </w:r>
+    </w:p>
+    <w:p>
+      <w:pPr>
+        <w:pStyle w:val="ListBullet"/>
+      </w:pPr>
+      <w:r>
+        <w:t>One scan would imply everything; less reading.</w:t>
+      </w:r>
+    </w:p>
+    <w:p>
+      <w:r>
+        <w:rPr>
+          <w:b w:val="0"/>
+          <w:i/>
+        </w:rPr>
+        <w:t>Cons:</w:t>
+      </w:r>
+    </w:p>
+    <w:p>
+      <w:pPr>
+        <w:pStyle w:val="ListBullet"/>
+      </w:pPr>
+      <w:r>
+        <w:t>Wrong the moment contents change — the crate identity says nothing about what is inside.</w:t>
+      </w:r>
+    </w:p>
+    <w:p>
+      <w:pPr>
+        <w:pStyle w:val="ListBullet"/>
+      </w:pPr>
+      <w:r>
+        <w:t>Brittle; would silently deliver the wrong things.</w:t>
+      </w:r>
+    </w:p>
+    <w:p>
+      <w:r>
+        <w:rPr>
+          <w:b/>
+          <w:color w:val="1F497D"/>
+        </w:rPr>
+        <w:t xml:space="preserve">Decision &amp; rationale: </w:t>
+      </w:r>
+      <w:r>
+        <w:t>Reconcile by ACTUAL contents; never infer a set from a container or serial. This is the single most important correctness decision.</w:t>
+      </w:r>
+    </w:p>
+    <w:p>
+      <w:pPr>
+        <w:pStyle w:val="Heading2"/>
+      </w:pPr>
+      <w:r>
+        <w:t>4.3 Returnable container modelling</w:t>
+      </w:r>
+    </w:p>
+    <w:p>
+      <w:r>
+        <w:rPr>
+          <w:b/>
+          <w:i w:val="0"/>
+        </w:rPr>
+        <w:t>Serial-tracked PRODUCT (Eurobak 40)</w:t>
+      </w:r>
+    </w:p>
+    <w:p>
+      <w:r>
+        <w:rPr>
+          <w:b w:val="0"/>
+          <w:i/>
+        </w:rPr>
+        <w:t>Pros:</w:t>
+      </w:r>
+    </w:p>
+    <w:p>
+      <w:pPr>
+        <w:pStyle w:val="ListBullet"/>
+      </w:pPr>
+      <w:r>
+        <w:t>Native; counted like any product; per-crate delivery/return identity via the serial.</w:t>
+      </w:r>
+    </w:p>
+    <w:p>
+      <w:pPr>
+        <w:pStyle w:val="ListBullet"/>
+      </w:pPr>
+      <w:r>
+        <w:t>The product already exists as a set component.</w:t>
+      </w:r>
+    </w:p>
+    <w:p>
+      <w:pPr>
+        <w:pStyle w:val="ListBullet"/>
+      </w:pPr>
+      <w:r>
+        <w:t>No custom lifecycle code.</w:t>
+      </w:r>
+    </w:p>
+    <w:p>
+      <w:r>
+        <w:rPr>
+          <w:b w:val="0"/>
+          <w:i/>
+        </w:rPr>
+        <w:t>Cons:</w:t>
+      </w:r>
+    </w:p>
+    <w:p>
+      <w:pPr>
+        <w:pStyle w:val="ListBullet"/>
+      </w:pPr>
+      <w:r>
+        <w:t>None material.</w:t>
+      </w:r>
+    </w:p>
+    <w:p>
+      <w:r>
+        <w:rPr>
+          <w:b/>
+          <w:i w:val="0"/>
+        </w:rPr>
+        <w:t>A custom "returnable packaging" object</w:t>
+      </w:r>
+    </w:p>
+    <w:p>
+      <w:r>
+        <w:rPr>
+          <w:b w:val="0"/>
+          <w:i/>
+        </w:rPr>
+        <w:t>Pros:</w:t>
+      </w:r>
+    </w:p>
+    <w:p>
+      <w:pPr>
+        <w:pStyle w:val="ListBullet"/>
+      </w:pPr>
+      <w:r>
+        <w:t>Could model a bespoke lifecycle.</w:t>
+      </w:r>
+    </w:p>
+    <w:p>
+      <w:r>
+        <w:rPr>
+          <w:b w:val="0"/>
+          <w:i/>
+        </w:rPr>
+        <w:t>Cons:</w:t>
+      </w:r>
+    </w:p>
+    <w:p>
+      <w:pPr>
+        <w:pStyle w:val="ListBullet"/>
+      </w:pPr>
+      <w:r>
+        <w:t>Reinvents what serial tracking already provides; more code and maintenance.</w:t>
+      </w:r>
+    </w:p>
+    <w:p>
+      <w:r>
+        <w:rPr>
+          <w:b/>
+          <w:i w:val="0"/>
+        </w:rPr>
+        <w:t>Force package-ID = crate serial</w:t>
+      </w:r>
+    </w:p>
+    <w:p>
+      <w:r>
+        <w:rPr>
+          <w:b w:val="0"/>
+          <w:i/>
+        </w:rPr>
+        <w:t>Pros:</w:t>
+      </w:r>
+    </w:p>
+    <w:p>
+      <w:pPr>
+        <w:pStyle w:val="ListBullet"/>
+      </w:pPr>
+      <w:r>
+        <w:t>A single identifier for convenience.</w:t>
+      </w:r>
+    </w:p>
+    <w:p>
+      <w:r>
+        <w:rPr>
+          <w:b w:val="0"/>
+          <w:i/>
+        </w:rPr>
+        <w:t>Cons:</w:t>
+      </w:r>
+    </w:p>
+    <w:p>
+      <w:pPr>
+        <w:pStyle w:val="ListBullet"/>
+      </w:pPr>
+      <w:r>
+        <w:t>Couples two independent objects; dedicates a "reusable" tote to one crate (contradicts the generic/reusable model); custom logic fighting Odoo's grain.</w:t>
+      </w:r>
+    </w:p>
+    <w:p>
+      <w:r>
+        <w:rPr>
+          <w:b/>
+          <w:color w:val="1F497D"/>
+        </w:rPr>
+        <w:t xml:space="preserve">Decision &amp; rationale: </w:t>
+      </w:r>
+      <w:r>
+        <w:t>Model the returnable crate as a serial-tracked product. Do not couple package name to serial; the package already references the serial via its quants.</w:t>
+      </w:r>
+    </w:p>
+    <w:p>
+      <w:pPr>
+        <w:pStyle w:val="Heading2"/>
+      </w:pPr>
+      <w:r>
+        <w:t>4.4 What happens to the package at customer delivery</w:t>
+      </w:r>
+    </w:p>
+    <w:p>
+      <w:r>
+        <w:rPr>
+          <w:b/>
+          <w:i w:val="0"/>
+        </w:rPr>
+        <w:t>(i) Dissolve — goods delivered loose, label freed immediately</w:t>
+      </w:r>
+    </w:p>
+    <w:p>
+      <w:r>
+        <w:rPr>
+          <w:b w:val="0"/>
+          <w:i/>
+        </w:rPr>
+        <w:t>Pros:</w:t>
+      </w:r>
+    </w:p>
+    <w:p>
+      <w:pPr>
+        <w:pStyle w:val="ListBullet"/>
+      </w:pPr>
+      <w:r>
+        <w:t>Simple; native for reusable totes; no clutter at customer locations.</w:t>
+      </w:r>
+    </w:p>
+    <w:p>
+      <w:r>
+        <w:rPr>
+          <w:b w:val="0"/>
+          <w:i/>
+        </w:rPr>
+        <w:t>Cons:</w:t>
+      </w:r>
+    </w:p>
+    <w:p>
+      <w:pPr>
+        <w:pStyle w:val="ListBullet"/>
+      </w:pPr>
+      <w:r>
+        <w:t>No container record at the customer.</w:t>
+      </w:r>
+    </w:p>
+    <w:p>
+      <w:r>
+        <w:rPr>
+          <w:b/>
+          <w:i w:val="0"/>
+        </w:rPr>
+        <w:t>(ii) Travel with the goods — package goes to the customer</w:t>
+      </w:r>
+    </w:p>
+    <w:p>
+      <w:r>
+        <w:rPr>
+          <w:b w:val="0"/>
+          <w:i/>
+        </w:rPr>
+        <w:t>Pros:</w:t>
+      </w:r>
+    </w:p>
+    <w:p>
+      <w:pPr>
+        <w:pStyle w:val="ListBullet"/>
+      </w:pPr>
+      <w:r>
+        <w:t>Physical fidelity; "package at customer" visibility; return-as-a-unit.</w:t>
+      </w:r>
+    </w:p>
+    <w:p>
+      <w:r>
+        <w:rPr>
+          <w:b w:val="0"/>
+          <w:i/>
+        </w:rPr>
+        <w:t>Cons:</w:t>
+      </w:r>
+    </w:p>
+    <w:p>
+      <w:pPr>
+        <w:pStyle w:val="ListBullet"/>
+      </w:pPr>
+      <w:r>
+        <w:t>Odoo traveling boxes are the "disposable" type — no native reuse lifecycle.</w:t>
+      </w:r>
+    </w:p>
+    <w:p>
+      <w:pPr>
+        <w:pStyle w:val="ListBullet"/>
+      </w:pPr>
+      <w:r>
+        <w:t>Packages accumulate at customer locations (must be emptied on return).</w:t>
+      </w:r>
+    </w:p>
+    <w:p>
+      <w:pPr>
+        <w:pStyle w:val="ListBullet"/>
+      </w:pPr>
+      <w:r>
+        <w:t>Redundant with the serial identity; needs manual reuse or custom code.</w:t>
+      </w:r>
+    </w:p>
+    <w:p>
+      <w:r>
+        <w:rPr>
+          <w:b w:val="0"/>
+          <w:i/>
+        </w:rPr>
+        <w:t>Sub-options within (ii):</w:t>
+      </w:r>
+    </w:p>
+    <w:p>
+      <w:pPr>
+        <w:pStyle w:val="ListBullet"/>
+      </w:pPr>
+      <w:r>
+        <w:t>(ii-a) Disposable box that travels: native travel, but reuse of the label is manual.</w:t>
+      </w:r>
+    </w:p>
+    <w:p>
+      <w:pPr>
+        <w:pStyle w:val="ListBullet"/>
+      </w:pPr>
+      <w:r>
+        <w:t>(ii-b) Reusable box + custom override to travel: reuse lifecycle AND travel, at the cost of custom code.</w:t>
+      </w:r>
+    </w:p>
+    <w:p>
+      <w:r>
+        <w:rPr>
+          <w:b/>
+          <w:i w:val="0"/>
+        </w:rPr>
+        <w:t>(iii) Serial is the identity; package dissolves at delivery</w:t>
+      </w:r>
+    </w:p>
+    <w:p>
+      <w:r>
+        <w:rPr>
+          <w:b w:val="0"/>
+          <w:i/>
+        </w:rPr>
+        <w:t>Pros:</w:t>
+      </w:r>
+    </w:p>
+    <w:p>
+      <w:pPr>
+        <w:pStyle w:val="ListBullet"/>
+      </w:pPr>
+      <w:r>
+        <w:t>Minimal custom code.</w:t>
+      </w:r>
+    </w:p>
+    <w:p>
+      <w:pPr>
+        <w:pStyle w:val="ListBullet"/>
+      </w:pPr>
+      <w:r>
+        <w:t>The serial-tracked crate itself travels and returns, so it IS the durable reusable label — "travels + reused" comes from the product, not a customised package.</w:t>
+      </w:r>
+    </w:p>
+    <w:p>
+      <w:pPr>
+        <w:pStyle w:val="ListBullet"/>
+      </w:pPr>
+      <w:r>
+        <w:t>Per-crate identity via serial; native reusable behaviour; no clutter.</w:t>
+      </w:r>
+    </w:p>
+    <w:p>
+      <w:r>
+        <w:rPr>
+          <w:b w:val="0"/>
+          <w:i/>
+        </w:rPr>
+        <w:t>Cons:</w:t>
+      </w:r>
+    </w:p>
+    <w:p>
+      <w:pPr>
+        <w:pStyle w:val="ListBullet"/>
+      </w:pPr>
+      <w:r>
+        <w:t>No live "package at customer" object — container-at-customer traceability is via the delivery record + serial.</w:t>
+      </w:r>
+    </w:p>
+    <w:p>
+      <w:pPr>
+        <w:pStyle w:val="ListBullet"/>
+      </w:pPr>
+      <w:r>
+        <w:t>Container return is reconciled per serial + quantity, not as one package unit.</w:t>
+      </w:r>
+    </w:p>
+    <w:p>
+      <w:r>
+        <w:rPr>
+          <w:b/>
+          <w:color w:val="1F497D"/>
+        </w:rPr>
+        <w:t xml:space="preserve">Decision &amp; rationale: </w:t>
+      </w:r>
+      <w:r>
+        <w:t>Option (iii). The serial-tracked crate gives travels-and-reused from the product side with almost no customisation. (ii-a) has no reuse lifecycle and clutters customer locations; (ii-b) adds custom code to make a reusable box travel — unnecessary given the serial already does the job.</w:t>
+      </w:r>
+    </w:p>
+    <w:p>
+      <w:pPr>
+        <w:pStyle w:val="Heading2"/>
+      </w:pPr>
+      <w:r>
+        <w:t>4.5 Overflow handling (package holds more than demand)</w:t>
+      </w:r>
+    </w:p>
+    <w:p>
+      <w:r>
+        <w:rPr>
+          <w:b/>
+          <w:i w:val="0"/>
+        </w:rPr>
+        <w:t>Hard reject the scan</w:t>
+      </w:r>
+    </w:p>
+    <w:p>
+      <w:r>
+        <w:rPr>
+          <w:b w:val="0"/>
+          <w:i/>
+        </w:rPr>
+        <w:t>Pros:</w:t>
+      </w:r>
+    </w:p>
+    <w:p>
+      <w:pPr>
+        <w:pStyle w:val="ListBullet"/>
+      </w:pPr>
+      <w:r>
+        <w:t>Strict and safe.</w:t>
+      </w:r>
+    </w:p>
+    <w:p>
+      <w:r>
+        <w:rPr>
+          <w:b w:val="0"/>
+          <w:i/>
+        </w:rPr>
+        <w:t>Cons:</w:t>
+      </w:r>
+    </w:p>
+    <w:p>
+      <w:pPr>
+        <w:pStyle w:val="ListBullet"/>
+      </w:pPr>
+      <w:r>
+        <w:t>Blocks legitimate partial use; forces manual repackaging with no guidance.</w:t>
+      </w:r>
+    </w:p>
+    <w:p>
+      <w:r>
+        <w:rPr>
+          <w:b/>
+          <w:i w:val="0"/>
+        </w:rPr>
+        <w:t>Silently split (consume up to demand, leave the rest)</w:t>
+      </w:r>
+    </w:p>
+    <w:p>
+      <w:r>
+        <w:rPr>
+          <w:b w:val="0"/>
+          <w:i/>
+        </w:rPr>
+        <w:t>Pros:</w:t>
+      </w:r>
+    </w:p>
+    <w:p>
+      <w:pPr>
+        <w:pStyle w:val="ListBullet"/>
+      </w:pPr>
+      <w:r>
+        <w:t>Convenient; no interruption.</w:t>
+      </w:r>
+    </w:p>
+    <w:p>
+      <w:r>
+        <w:rPr>
+          <w:b w:val="0"/>
+          <w:i/>
+        </w:rPr>
+        <w:t>Cons:</w:t>
+      </w:r>
+    </w:p>
+    <w:p>
+      <w:pPr>
+        <w:pStyle w:val="ListBullet"/>
+      </w:pPr>
+      <w:r>
+        <w:t>Hides real physical work; risk of unaccounted items and confusion.</w:t>
+      </w:r>
+    </w:p>
+    <w:p>
+      <w:r>
+        <w:rPr>
+          <w:b/>
+          <w:i w:val="0"/>
+        </w:rPr>
+        <w:t>Prompt the picker to split</w:t>
+      </w:r>
+    </w:p>
+    <w:p>
+      <w:r>
+        <w:rPr>
+          <w:b w:val="0"/>
+          <w:i/>
+        </w:rPr>
+        <w:t>Pros:</w:t>
+      </w:r>
+    </w:p>
+    <w:p>
+      <w:pPr>
+        <w:pStyle w:val="ListBullet"/>
+      </w:pPr>
+      <w:r>
+        <w:t>Explicit acknowledgement that opening a package is real work; flexible; elegant.</w:t>
+      </w:r>
+    </w:p>
+    <w:p>
+      <w:r>
+        <w:rPr>
+          <w:b w:val="0"/>
+          <w:i/>
+        </w:rPr>
+        <w:t>Cons:</w:t>
+      </w:r>
+    </w:p>
+    <w:p>
+      <w:pPr>
+        <w:pStyle w:val="ListBullet"/>
+      </w:pPr>
+      <w:r>
+        <w:t>One extra interaction.</w:t>
+      </w:r>
+    </w:p>
+    <w:p>
+      <w:r>
+        <w:rPr>
+          <w:b/>
+          <w:color w:val="1F497D"/>
+        </w:rPr>
+        <w:t xml:space="preserve">Decision &amp; rationale: </w:t>
+      </w:r>
+      <w:r>
+        <w:t>Prompt to split (PPB-06). If genuinely extra stock is needed, the picker adds a line manually (PPB-05) — additions stay explicit and auditable.</w:t>
+      </w:r>
+    </w:p>
+    <w:p>
+      <w:pPr>
+        <w:pStyle w:val="Heading2"/>
+      </w:pPr>
+      <w:r>
+        <w:t>4.6 Operation-type scope</w:t>
+      </w:r>
+    </w:p>
+    <w:p>
+      <w:r>
+        <w:rPr>
+          <w:b/>
+          <w:i w:val="0"/>
+        </w:rPr>
+        <w:t>Any operation type (outbound, internal, inbound)</w:t>
+      </w:r>
+    </w:p>
+    <w:p>
+      <w:r>
+        <w:rPr>
+          <w:b w:val="0"/>
+          <w:i/>
+        </w:rPr>
+        <w:t>Pros:</w:t>
+      </w:r>
+    </w:p>
+    <w:p>
+      <w:pPr>
+        <w:pStyle w:val="ListBullet"/>
+      </w:pPr>
+      <w:r>
+        <w:t>Reusable on inbound (e.g. regroup returned products into packages before moving to stock) and internal transfers; consistent behaviour everywhere.</w:t>
+      </w:r>
+    </w:p>
+    <w:p>
+      <w:r>
+        <w:rPr>
+          <w:b w:val="0"/>
+          <w:i/>
+        </w:rPr>
+        <w:t>Cons:</w:t>
+      </w:r>
+    </w:p>
+    <w:p>
+      <w:pPr>
+        <w:pStyle w:val="ListBullet"/>
+      </w:pPr>
+      <w:r>
+        <w:t>None.</w:t>
+      </w:r>
+    </w:p>
+    <w:p>
+      <w:r>
+        <w:rPr>
+          <w:b/>
+          <w:i w:val="0"/>
+        </w:rPr>
+        <w:t>Outbound only</w:t>
+      </w:r>
+    </w:p>
+    <w:p>
+      <w:r>
+        <w:rPr>
+          <w:b w:val="0"/>
+          <w:i/>
+        </w:rPr>
+        <w:t>Pros:</w:t>
+      </w:r>
+    </w:p>
+    <w:p>
+      <w:pPr>
+        <w:pStyle w:val="ListBullet"/>
+      </w:pPr>
+      <w:r>
+        <w:t>Slightly smaller surface.</w:t>
+      </w:r>
+    </w:p>
+    <w:p>
+      <w:r>
+        <w:rPr>
+          <w:b w:val="0"/>
+          <w:i/>
+        </w:rPr>
+        <w:t>Cons:</w:t>
+      </w:r>
+    </w:p>
+    <w:p>
+      <w:pPr>
+        <w:pStyle w:val="ListBullet"/>
+      </w:pPr>
+      <w:r>
+        <w:t>Misses the inbound regroup use case that was explicitly requested.</w:t>
+      </w:r>
+    </w:p>
+    <w:p>
+      <w:r>
+        <w:rPr>
+          <w:b/>
+          <w:color w:val="1F497D"/>
+        </w:rPr>
+        <w:t xml:space="preserve">Decision &amp; rationale: </w:t>
+      </w:r>
+      <w:r>
+        <w:t>Any operation type; not gated.</w:t>
+      </w:r>
+    </w:p>
+    <w:p>
+      <w:pPr>
+        <w:pStyle w:val="Heading2"/>
+      </w:pPr>
+      <w:r>
+        <w:t>4.7 Module placement</w:t>
+      </w:r>
+    </w:p>
+    <w:p>
+      <w:r>
+        <w:rPr>
+          <w:b/>
+          <w:i w:val="0"/>
+        </w:rPr>
+        <w:t>One general module: rental_scanning (depends on stock_barcode)</w:t>
+      </w:r>
+    </w:p>
+    <w:p>
+      <w:r>
+        <w:rPr>
+          <w:b w:val="0"/>
+          <w:i/>
+        </w:rPr>
+        <w:t>Pros:</w:t>
+      </w:r>
+    </w:p>
+    <w:p>
+      <w:pPr>
+        <w:pStyle w:val="ListBullet"/>
+      </w:pPr>
+      <w:r>
+        <w:t>Dependency hygiene — does not force Enterprise stock_barcode as a hard dependency on rental_set.</w:t>
+      </w:r>
+    </w:p>
+    <w:p>
+      <w:pPr>
+        <w:pStyle w:val="ListBullet"/>
+      </w:pPr>
+      <w:r>
+        <w:t>One home for all future scanning work; the feature is generic (works for non-set pickings too).</w:t>
+      </w:r>
+    </w:p>
+    <w:p>
+      <w:r>
+        <w:rPr>
+          <w:b w:val="0"/>
+          <w:i/>
+        </w:rPr>
+        <w:t>Cons:</w:t>
+      </w:r>
+    </w:p>
+    <w:p>
+      <w:pPr>
+        <w:pStyle w:val="ListBullet"/>
+      </w:pPr>
+      <w:r>
+        <w:t>None material.</w:t>
+      </w:r>
+    </w:p>
+    <w:p>
+      <w:r>
+        <w:rPr>
+          <w:b/>
+          <w:i w:val="0"/>
+        </w:rPr>
+        <w:t>Put it inside rental_set</w:t>
+      </w:r>
+    </w:p>
+    <w:p>
+      <w:r>
+        <w:rPr>
+          <w:b w:val="0"/>
+          <w:i/>
+        </w:rPr>
+        <w:t>Pros:</w:t>
+      </w:r>
+    </w:p>
+    <w:p>
+      <w:pPr>
+        <w:pStyle w:val="ListBullet"/>
+      </w:pPr>
+      <w:r>
+        <w:t>Fewer modules.</w:t>
+      </w:r>
+    </w:p>
+    <w:p>
+      <w:r>
+        <w:rPr>
+          <w:b w:val="0"/>
+          <w:i/>
+        </w:rPr>
+        <w:t>Cons:</w:t>
+      </w:r>
+    </w:p>
+    <w:p>
+      <w:pPr>
+        <w:pStyle w:val="ListBullet"/>
+      </w:pPr>
+      <w:r>
+        <w:t>Forces a hard Enterprise dependency onto rental_set; the feature is not set-specific.</w:t>
+      </w:r>
+    </w:p>
+    <w:p>
+      <w:r>
+        <w:rPr>
+          <w:b/>
+          <w:i w:val="0"/>
+        </w:rPr>
+        <w:t>Many small modules</w:t>
+      </w:r>
+    </w:p>
+    <w:p>
+      <w:r>
+        <w:rPr>
+          <w:b w:val="0"/>
+          <w:i/>
+        </w:rPr>
+        <w:t>Pros:</w:t>
+      </w:r>
+    </w:p>
+    <w:p>
+      <w:pPr>
+        <w:pStyle w:val="ListBullet"/>
+      </w:pPr>
+      <w:r>
+        <w:t>Fine-grained install.</w:t>
+      </w:r>
+    </w:p>
+    <w:p>
+      <w:r>
+        <w:rPr>
+          <w:b w:val="0"/>
+          <w:i/>
+        </w:rPr>
+        <w:t>Cons:</w:t>
+      </w:r>
+    </w:p>
+    <w:p>
+      <w:pPr>
+        <w:pStyle w:val="ListBullet"/>
+      </w:pPr>
+      <w:r>
+        <w:t>Proliferation; risk when two modules patch the SAME barcode JS method.</w:t>
+      </w:r>
+    </w:p>
+    <w:p>
+      <w:r>
+        <w:rPr>
+          <w:b/>
+          <w:color w:val="1F497D"/>
+        </w:rPr>
+        <w:t xml:space="preserve">Decision &amp; rationale: </w:t>
+      </w:r>
+      <w:r>
+        <w:t>One module, rental_scanning. Split only when a genuinely different dependency footprint appears; keep same-JS-method patches together and compose via super().</w:t>
+      </w:r>
+    </w:p>
+    <w:p>
+      <w:pPr>
+        <w:pStyle w:val="Heading2"/>
+      </w:pPr>
+      <w:r>
+        <w:t>4.8 Reusable-container identification</w:t>
+      </w:r>
+    </w:p>
+    <w:p>
+      <w:r>
+        <w:rPr>
+          <w:b/>
+          <w:i w:val="0"/>
+        </w:rPr>
+        <w:t>Native reusable package types (package_use = "reusable")</w:t>
+      </w:r>
+    </w:p>
+    <w:p>
+      <w:r>
+        <w:rPr>
+          <w:b w:val="0"/>
+          <w:i/>
+        </w:rPr>
+        <w:t>Pros:</w:t>
+      </w:r>
+    </w:p>
+    <w:p>
+      <w:pPr>
+        <w:pStyle w:val="ListBullet"/>
+      </w:pPr>
+      <w:r>
+        <w:t>Scanning a reusable box adds its products, and the box is emptied/freed after use — both native.</w:t>
+      </w:r>
+    </w:p>
+    <w:p>
+      <w:r>
+        <w:rPr>
+          <w:b w:val="0"/>
+          <w:i/>
+        </w:rPr>
+        <w:t>Cons:</w:t>
+      </w:r>
+    </w:p>
+    <w:p>
+      <w:pPr>
+        <w:pStyle w:val="ListBullet"/>
+      </w:pPr>
+      <w:r>
+        <w:t>Package types are internally oriented (they do not travel to the customer — which suits Option iii).</w:t>
+      </w:r>
+    </w:p>
+    <w:p>
+      <w:r>
+        <w:rPr>
+          <w:b/>
+          <w:i w:val="0"/>
+        </w:rPr>
+        <w:t>Custom "reusable-label" metadata field on packages</w:t>
+      </w:r>
+    </w:p>
+    <w:p>
+      <w:r>
+        <w:rPr>
+          <w:b w:val="0"/>
+          <w:i/>
+        </w:rPr>
+        <w:t>Pros:</w:t>
+      </w:r>
+    </w:p>
+    <w:p>
+      <w:pPr>
+        <w:pStyle w:val="ListBullet"/>
+      </w:pPr>
+      <w:r>
+        <w:t>Bespoke reporting hooks.</w:t>
+      </w:r>
+    </w:p>
+    <w:p>
+      <w:r>
+        <w:rPr>
+          <w:b w:val="0"/>
+          <w:i/>
+        </w:rPr>
+        <w:t>Cons:</w:t>
+      </w:r>
+    </w:p>
+    <w:p>
+      <w:pPr>
+        <w:pStyle w:val="ListBullet"/>
+      </w:pPr>
+      <w:r>
+        <w:t>Redundant with native reusable types + the set barcode; extra surface; keeps packages non-generic.</w:t>
+      </w:r>
+    </w:p>
+    <w:p>
+      <w:r>
+        <w:rPr>
+          <w:b/>
+          <w:color w:val="1F497D"/>
+        </w:rPr>
+        <w:t xml:space="preserve">Decision &amp; rationale: </w:t>
+      </w:r>
+      <w:r>
+        <w:t>Reuse native reusable package types; drop the custom metadata field (packages stay generic).</w:t>
+      </w:r>
+    </w:p>
+    <w:p>
+      <w:pPr>
+        <w:pStyle w:val="Heading2"/>
+      </w:pPr>
+      <w:r>
+        <w:t>4.9 Other confirmed choices</w:t>
+      </w:r>
+    </w:p>
+    <w:p>
+      <w:pPr>
+        <w:pStyle w:val="ListBullet"/>
+      </w:pPr>
+      <w:r>
+        <w:t>Serial-scan is equivalent to package-scan (PPB-13): scanning a content serial resolves to the package holding it and picks that package's actual contents. Chosen because it is contents-driven (truthful) and uses a native serial-&gt;package lookup; the alternative (serial drives a set) was rejected in 4.2.</w:t>
+      </w:r>
+    </w:p>
+    <w:p>
+      <w:pPr>
+        <w:pStyle w:val="ListBullet"/>
+      </w:pPr>
+      <w:r>
+        <w:t>Set-scan (PPB-12) is a SEPARATE, definition-driven feature: it fills a set's expected components when no physical package exists. Kept separate from the container scan so physical truth and a template are never conflated.</w:t>
+      </w:r>
+    </w:p>
+    <w:p>
+      <w:pPr>
+        <w:pStyle w:val="ListBullet"/>
+      </w:pPr>
+      <w:r>
+        <w:t>Multilingual (en + nl + fr): Belgian operation; warehouse staff use Dutch/French.</w:t>
+      </w:r>
+    </w:p>
+    <w:p>
+      <w:pPr>
+        <w:pStyle w:val="Heading2"/>
+      </w:pPr>
+      <w:r>
+        <w:t>4.10 Decision summary</w:t>
       </w:r>
     </w:p>
     <w:tbl>
@@ -298,28 +1552,27 @@
         <w:tblLook w:firstColumn="1" w:firstRow="1" w:lastColumn="0" w:lastRow="0" w:noHBand="0" w:noVBand="1" w:val="04A0"/>
       </w:tblPr>
       <w:tblGrid>
-        <w:gridCol w:w="2160"/>
-        <w:gridCol w:w="2160"/>
-        <w:gridCol w:w="2160"/>
-        <w:gridCol w:w="2160"/>
+        <w:gridCol w:w="2880"/>
+        <w:gridCol w:w="2880"/>
+        <w:gridCol w:w="2880"/>
       </w:tblGrid>
       <w:tr>
         <w:tc>
           <w:tcPr>
-            <w:tcW w:type="dxa" w:w="2160"/>
+            <w:tcW w:type="dxa" w:w="2880"/>
           </w:tcPr>
           <w:p>
             <w:r>
               <w:rPr>
                 <w:b/>
               </w:rPr>
-              <w:t>Decision</w:t>
+              <w:t>#</w:t>
             </w:r>
           </w:p>
         </w:tc>
         <w:tc>
           <w:tcPr>
-            <w:tcW w:type="dxa" w:w="2160"/>
+            <w:tcW w:type="dxa" w:w="2880"/>
           </w:tcPr>
           <w:p>
             <w:r>
@@ -332,27 +1585,14 @@
         </w:tc>
         <w:tc>
           <w:tcPr>
-            <w:tcW w:type="dxa" w:w="2160"/>
+            <w:tcW w:type="dxa" w:w="2880"/>
           </w:tcPr>
           <w:p>
             <w:r>
               <w:rPr>
                 <w:b/>
               </w:rPr>
-              <w:t>Rejected alternative(s)</w:t>
-            </w:r>
-          </w:p>
-        </w:tc>
-        <w:tc>
-          <w:tcPr>
-            <w:tcW w:type="dxa" w:w="2160"/>
-          </w:tcPr>
-          <w:p>
-            <w:r>
-              <w:rPr>
-                <w:b/>
-              </w:rPr>
-              <w:t>Why</w:t>
+              <w:t>Rejected</w:t>
             </w:r>
           </w:p>
         </w:tc>
@@ -360,41 +1600,31 @@
       <w:tr>
         <w:tc>
           <w:tcPr>
-            <w:tcW w:type="dxa" w:w="2160"/>
+            <w:tcW w:type="dxa" w:w="2880"/>
           </w:tcPr>
           <w:p>
             <w:r>
-              <w:t>D-01 Manual late binding (Option A)</w:t>
+              <w:t>D-01</w:t>
             </w:r>
           </w:p>
         </w:tc>
         <w:tc>
           <w:tcPr>
-            <w:tcW w:type="dxa" w:w="2160"/>
+            <w:tcW w:type="dxa" w:w="2880"/>
           </w:tcPr>
           <w:p>
             <w:r>
-              <w:t>Scan/select a prepared package at pick time.</w:t>
+              <w:t>Manual late binding (A)</w:t>
             </w:r>
           </w:p>
         </w:tc>
         <w:tc>
           <w:tcPr>
-            <w:tcW w:type="dxa" w:w="2160"/>
+            <w:tcW w:type="dxa" w:w="2880"/>
           </w:tcPr>
           <w:p>
             <w:r>
-              <w:t>Auto-reserve a matching package (Option B).</w:t>
-            </w:r>
-          </w:p>
-        </w:tc>
-        <w:tc>
-          <w:tcPr>
-            <w:tcW w:type="dxa" w:w="2160"/>
-          </w:tcPr>
-          <w:p>
-            <w:r>
-              <w:t>You do not know which package serves which order until picking; manual selection is closest to Odoo standard. Auto-reservation adds significant matching logic and edge cases; deferred, can be layered later.</w:t>
+              <w:t>Auto-reserve (B)</w:t>
             </w:r>
           </w:p>
         </w:tc>
@@ -402,41 +1632,31 @@
       <w:tr>
         <w:tc>
           <w:tcPr>
-            <w:tcW w:type="dxa" w:w="2160"/>
+            <w:tcW w:type="dxa" w:w="2880"/>
           </w:tcPr>
           <w:p>
             <w:r>
-              <w:t>D-02 Container = generic package, reconciled by ACTUAL contents</w:t>
+              <w:t>D-02</w:t>
             </w:r>
           </w:p>
         </w:tc>
         <w:tc>
           <w:tcPr>
-            <w:tcW w:type="dxa" w:w="2160"/>
+            <w:tcW w:type="dxa" w:w="2880"/>
           </w:tcPr>
           <w:p>
             <w:r>
-              <w:t>Read the package's real quants and match them to demand.</w:t>
+              <w:t>Reconcile actual contents</w:t>
             </w:r>
           </w:p>
         </w:tc>
         <w:tc>
           <w:tcPr>
-            <w:tcW w:type="dxa" w:w="2160"/>
+            <w:tcW w:type="dxa" w:w="2880"/>
           </w:tcPr>
           <w:p>
             <w:r>
-              <w:t>Infer contents/"the set" from the container or its crate serial (old Approach B).</w:t>
-            </w:r>
-          </w:p>
-        </w:tc>
-        <w:tc>
-          <w:tcPr>
-            <w:tcW w:type="dxa" w:w="2160"/>
-          </w:tcPr>
-          <w:p>
-            <w:r>
-              <w:t>A crate is reusable and its contents vary (40 glasses today, 40 plates tomorrow). The identity of the box therefore says nothing about what is inside; only the live contents are trustworthy.</w:t>
+              <w:t>Infer set from container/serial</w:t>
             </w:r>
           </w:p>
         </w:tc>
@@ -444,41 +1664,31 @@
       <w:tr>
         <w:tc>
           <w:tcPr>
-            <w:tcW w:type="dxa" w:w="2160"/>
+            <w:tcW w:type="dxa" w:w="2880"/>
           </w:tcPr>
           <w:p>
             <w:r>
-              <w:t>D-03 Returnable container = serial-tracked PRODUCT</w:t>
+              <w:t>D-03</w:t>
             </w:r>
           </w:p>
         </w:tc>
         <w:tc>
           <w:tcPr>
-            <w:tcW w:type="dxa" w:w="2160"/>
+            <w:tcW w:type="dxa" w:w="2880"/>
           </w:tcPr>
           <w:p>
             <w:r>
-              <w:t>Model the crate (Eurobak 40) as a serial-tracked product.</w:t>
+              <w:t>Serial-tracked product</w:t>
             </w:r>
           </w:p>
         </w:tc>
         <w:tc>
           <w:tcPr>
-            <w:tcW w:type="dxa" w:w="2160"/>
+            <w:tcW w:type="dxa" w:w="2880"/>
           </w:tcPr>
           <w:p>
             <w:r>
-              <w:t>A custom "returnable packaging" object; forcing package-ID = serial.</w:t>
-            </w:r>
-          </w:p>
-        </w:tc>
-        <w:tc>
-          <w:tcPr>
-            <w:tcW w:type="dxa" w:w="2160"/>
-          </w:tcPr>
-          <w:p>
-            <w:r>
-              <w:t>Odoo has no first-class returnable-transport-packaging. The standard pattern is a tracked/rented product; it gives per-crate delivery/return identity natively and is counted like any product. Coupling a package name to a serial fights the generic/reusable model and needs custom code.</w:t>
+              <w:t>Custom returnable object / package-ID=serial</w:t>
             </w:r>
           </w:p>
         </w:tc>
@@ -486,41 +1696,31 @@
       <w:tr>
         <w:tc>
           <w:tcPr>
-            <w:tcW w:type="dxa" w:w="2160"/>
+            <w:tcW w:type="dxa" w:w="2880"/>
           </w:tcPr>
           <w:p>
             <w:r>
-              <w:t>D-04 Option (iii): package dissolves at delivery; serial is the durable label</w:t>
+              <w:t>D-04</w:t>
             </w:r>
           </w:p>
         </w:tc>
         <w:tc>
           <w:tcPr>
-            <w:tcW w:type="dxa" w:w="2160"/>
+            <w:tcW w:type="dxa" w:w="2880"/>
           </w:tcPr>
           <w:p>
             <w:r>
-              <w:t>The serial-tracked crate itself travels to the client and returns, so it IS the reusable label.</w:t>
+              <w:t>Option (iii) package dissolves; serial=label</w:t>
             </w:r>
           </w:p>
         </w:tc>
         <w:tc>
           <w:tcPr>
-            <w:tcW w:type="dxa" w:w="2160"/>
+            <w:tcW w:type="dxa" w:w="2880"/>
           </w:tcPr>
           <w:p>
             <w:r>
-              <w:t>(ii-a) disposable box that travels; (ii-b) reusable box + custom override to travel.</w:t>
-            </w:r>
-          </w:p>
-        </w:tc>
-        <w:tc>
-          <w:tcPr>
-            <w:tcW w:type="dxa" w:w="2160"/>
-          </w:tcPr>
-          <w:p>
-            <w:r>
-              <w:t>The crate serial already provides "travels + reused" from the product side, with per-crate identity, and needs almost no customization. (ii-a) has no reuse lifecycle and clutters customer locations; (ii-b) adds custom code to make a reusable box travel — unnecessary.</w:t>
+              <w:t>(i) dissolve-only / (ii-a) / (ii-b) travel</w:t>
             </w:r>
           </w:p>
         </w:tc>
@@ -528,41 +1728,31 @@
       <w:tr>
         <w:tc>
           <w:tcPr>
-            <w:tcW w:type="dxa" w:w="2160"/>
+            <w:tcW w:type="dxa" w:w="2880"/>
           </w:tcPr>
           <w:p>
             <w:r>
-              <w:t>D-05 Serial-scan is equivalent to package-scan</w:t>
+              <w:t>D-05</w:t>
             </w:r>
           </w:p>
         </w:tc>
         <w:tc>
           <w:tcPr>
-            <w:tcW w:type="dxa" w:w="2160"/>
+            <w:tcW w:type="dxa" w:w="2880"/>
           </w:tcPr>
           <w:p>
             <w:r>
-              <w:t>Scanning a content serial resolves to the package that currently holds it and picks that package's actual contents.</w:t>
+              <w:t>Overflow -&gt; ask to split</w:t>
             </w:r>
           </w:p>
         </w:tc>
         <w:tc>
           <w:tcPr>
-            <w:tcW w:type="dxa" w:w="2160"/>
+            <w:tcW w:type="dxa" w:w="2880"/>
           </w:tcPr>
           <w:p>
             <w:r>
-              <w:t>Serial-scan drives a set definition.</w:t>
-            </w:r>
-          </w:p>
-        </w:tc>
-        <w:tc>
-          <w:tcPr>
-            <w:tcW w:type="dxa" w:w="2160"/>
-          </w:tcPr>
-          <w:p>
-            <w:r>
-              <w:t>Contents-driven resolution stays truthful when contents vary; Odoo can natively find which package holds a serial. Driving a set from a serial was rejected under D-02.</w:t>
+              <w:t>Hard reject / silent split</w:t>
             </w:r>
           </w:p>
         </w:tc>
@@ -570,41 +1760,31 @@
       <w:tr>
         <w:tc>
           <w:tcPr>
-            <w:tcW w:type="dxa" w:w="2160"/>
+            <w:tcW w:type="dxa" w:w="2880"/>
           </w:tcPr>
           <w:p>
             <w:r>
-              <w:t>D-06 Set-scan is a separate, definition-driven feature</w:t>
+              <w:t>D-06</w:t>
             </w:r>
           </w:p>
         </w:tc>
         <w:tc>
           <w:tcPr>
-            <w:tcW w:type="dxa" w:w="2160"/>
+            <w:tcW w:type="dxa" w:w="2880"/>
           </w:tcPr>
           <w:p>
             <w:r>
-              <w:t>Scanning a set barcode fills the set's expected components (PPB-12); no physical package needed.</w:t>
+              <w:t>Any operation type</w:t>
             </w:r>
           </w:p>
         </w:tc>
         <w:tc>
           <w:tcPr>
-            <w:tcW w:type="dxa" w:w="2160"/>
+            <w:tcW w:type="dxa" w:w="2880"/>
           </w:tcPr>
           <w:p>
             <w:r>
-              <w:t>Merge set-scan and container-scan into one.</w:t>
-            </w:r>
-          </w:p>
-        </w:tc>
-        <w:tc>
-          <w:tcPr>
-            <w:tcW w:type="dxa" w:w="2160"/>
-          </w:tcPr>
-          <w:p>
-            <w:r>
-              <w:t>They solve different needs: container-scan reflects physical truth; set-scan fills demand when no prepared box exists. Keeping them separate avoids conflating physical contents with a template.</w:t>
+              <w:t>Outbound only</w:t>
             </w:r>
           </w:p>
         </w:tc>
@@ -612,41 +1792,31 @@
       <w:tr>
         <w:tc>
           <w:tcPr>
-            <w:tcW w:type="dxa" w:w="2160"/>
+            <w:tcW w:type="dxa" w:w="2880"/>
           </w:tcPr>
           <w:p>
             <w:r>
-              <w:t>D-07 Overflow → ask to split (not hard-fail)</w:t>
+              <w:t>D-07</w:t>
             </w:r>
           </w:p>
         </w:tc>
         <w:tc>
           <w:tcPr>
-            <w:tcW w:type="dxa" w:w="2160"/>
+            <w:tcW w:type="dxa" w:w="2880"/>
           </w:tcPr>
           <w:p>
             <w:r>
-              <w:t>If a package holds more than needed, prompt the picker to split.</w:t>
+              <w:t>One module rental_scanning</w:t>
             </w:r>
           </w:p>
         </w:tc>
         <w:tc>
           <w:tcPr>
-            <w:tcW w:type="dxa" w:w="2160"/>
+            <w:tcW w:type="dxa" w:w="2880"/>
           </w:tcPr>
           <w:p>
             <w:r>
-              <w:t>Silently split, or hard-reject.</w:t>
-            </w:r>
-          </w:p>
-        </w:tc>
-        <w:tc>
-          <w:tcPr>
-            <w:tcW w:type="dxa" w:w="2160"/>
-          </w:tcPr>
-          <w:p>
-            <w:r>
-              <w:t>Removing items from a package is real physical work that must be acknowledged; a prompt is more elegant than a blunt error and prevents silent, invisible splitting.</w:t>
+              <w:t>Inside rental_set / many modules</w:t>
             </w:r>
           </w:p>
         </w:tc>
@@ -654,41 +1824,31 @@
       <w:tr>
         <w:tc>
           <w:tcPr>
-            <w:tcW w:type="dxa" w:w="2160"/>
+            <w:tcW w:type="dxa" w:w="2880"/>
           </w:tcPr>
           <w:p>
             <w:r>
-              <w:t>D-08 Extra stock must be added manually</w:t>
+              <w:t>D-08</w:t>
             </w:r>
           </w:p>
         </w:tc>
         <w:tc>
           <w:tcPr>
-            <w:tcW w:type="dxa" w:w="2160"/>
+            <w:tcW w:type="dxa" w:w="2880"/>
           </w:tcPr>
           <w:p>
             <w:r>
-              <w:t>If more than the package is genuinely needed, the picker adds a line explicitly.</w:t>
+              <w:t>Native reusable package types</w:t>
             </w:r>
           </w:p>
         </w:tc>
         <w:tc>
           <w:tcPr>
-            <w:tcW w:type="dxa" w:w="2160"/>
+            <w:tcW w:type="dxa" w:w="2880"/>
           </w:tcPr>
           <w:p>
             <w:r>
-              <w:t>Auto-pull extra from the package/stock.</w:t>
-            </w:r>
-          </w:p>
-        </w:tc>
-        <w:tc>
-          <w:tcPr>
-            <w:tcW w:type="dxa" w:w="2160"/>
-          </w:tcPr>
-          <w:p>
-            <w:r>
-              <w:t>Keeps additions explicit and auditable; prevents the demand-0 overflow seen previously.</w:t>
+              <w:t>Custom reusable-label field</w:t>
             </w:r>
           </w:p>
         </w:tc>
@@ -696,41 +1856,31 @@
       <w:tr>
         <w:tc>
           <w:tcPr>
-            <w:tcW w:type="dxa" w:w="2160"/>
+            <w:tcW w:type="dxa" w:w="2880"/>
           </w:tcPr>
           <w:p>
             <w:r>
-              <w:t>D-09 Works on ANY operation type</w:t>
+              <w:t>D-09</w:t>
             </w:r>
           </w:p>
         </w:tc>
         <w:tc>
           <w:tcPr>
-            <w:tcW w:type="dxa" w:w="2160"/>
+            <w:tcW w:type="dxa" w:w="2880"/>
           </w:tcPr>
           <w:p>
             <w:r>
-              <w:t>Outbound, internal and inbound.</w:t>
+              <w:t>Serial-scan = package-scan</w:t>
             </w:r>
           </w:p>
         </w:tc>
         <w:tc>
           <w:tcPr>
-            <w:tcW w:type="dxa" w:w="2160"/>
+            <w:tcW w:type="dxa" w:w="2880"/>
           </w:tcPr>
           <w:p>
             <w:r>
-              <w:t>Restrict to outbound only.</w:t>
-            </w:r>
-          </w:p>
-        </w:tc>
-        <w:tc>
-          <w:tcPr>
-            <w:tcW w:type="dxa" w:w="2160"/>
-          </w:tcPr>
-          <w:p>
-            <w:r>
-              <w:t>The same regrouping is useful on inbound (e.g. regroup returned products into packages before moving to stock). No reason to gate by operation type.</w:t>
+              <w:t>Serial drives a set</w:t>
             </w:r>
           </w:p>
         </w:tc>
@@ -738,41 +1888,31 @@
       <w:tr>
         <w:tc>
           <w:tcPr>
-            <w:tcW w:type="dxa" w:w="2160"/>
+            <w:tcW w:type="dxa" w:w="2880"/>
           </w:tcPr>
           <w:p>
             <w:r>
-              <w:t>D-10 One module: rental_scanning</w:t>
+              <w:t>D-10</w:t>
             </w:r>
           </w:p>
         </w:tc>
         <w:tc>
           <w:tcPr>
-            <w:tcW w:type="dxa" w:w="2160"/>
+            <w:tcW w:type="dxa" w:w="2880"/>
           </w:tcPr>
           <w:p>
             <w:r>
-              <w:t>A single barcode module, depending only on stock_barcode.</w:t>
+              <w:t>Set-scan separate (definition-driven)</w:t>
             </w:r>
           </w:p>
         </w:tc>
         <w:tc>
           <w:tcPr>
-            <w:tcW w:type="dxa" w:w="2160"/>
+            <w:tcW w:type="dxa" w:w="2880"/>
           </w:tcPr>
           <w:p>
             <w:r>
-              <w:t>Put it inside rental_set; or many tiny modules.</w:t>
-            </w:r>
-          </w:p>
-        </w:tc>
-        <w:tc>
-          <w:tcPr>
-            <w:tcW w:type="dxa" w:w="2160"/>
-          </w:tcPr>
-          <w:p>
-            <w:r>
-              <w:t>The feature is generic (works for non-set pickings too) and must not force an Enterprise (stock_barcode) hard-dependency onto rental_set. One module is the home for future scanning work; split only when a different dependency footprint appears.</w:t>
+              <w:t>Merge with container scan</w:t>
             </w:r>
           </w:p>
         </w:tc>
@@ -780,83 +1920,31 @@
       <w:tr>
         <w:tc>
           <w:tcPr>
-            <w:tcW w:type="dxa" w:w="2160"/>
+            <w:tcW w:type="dxa" w:w="2880"/>
           </w:tcPr>
           <w:p>
             <w:r>
-              <w:t>D-11 Reuse native reusable package types</w:t>
+              <w:t>D-11</w:t>
             </w:r>
           </w:p>
         </w:tc>
         <w:tc>
           <w:tcPr>
-            <w:tcW w:type="dxa" w:w="2160"/>
+            <w:tcW w:type="dxa" w:w="2880"/>
           </w:tcPr>
           <w:p>
             <w:r>
-              <w:t>Lean on package_use = "reusable" for scan-adds-contents and empty-after-use.</w:t>
+              <w:t>Multilingual en/nl/fr</w:t>
             </w:r>
           </w:p>
         </w:tc>
         <w:tc>
           <w:tcPr>
-            <w:tcW w:type="dxa" w:w="2160"/>
+            <w:tcW w:type="dxa" w:w="2880"/>
           </w:tcPr>
           <w:p>
             <w:r>
-              <w:t>Build a custom "reusable label" field / mechanism.</w:t>
-            </w:r>
-          </w:p>
-        </w:tc>
-        <w:tc>
-          <w:tcPr>
-            <w:tcW w:type="dxa" w:w="2160"/>
-          </w:tcPr>
-          <w:p>
-            <w:r>
-              <w:t>Native behaviour already covers scan-adds-contents and freeing the box; a custom metadata field was dropped as redundant. Keeps packages generic.</w:t>
-            </w:r>
-          </w:p>
-        </w:tc>
-      </w:tr>
-      <w:tr>
-        <w:tc>
-          <w:tcPr>
-            <w:tcW w:type="dxa" w:w="2160"/>
-          </w:tcPr>
-          <w:p>
-            <w:r>
-              <w:t>D-12 Multilingual (en + nl + fr)</w:t>
-            </w:r>
-          </w:p>
-        </w:tc>
-        <w:tc>
-          <w:tcPr>
-            <w:tcW w:type="dxa" w:w="2160"/>
-          </w:tcPr>
-          <w:p>
-            <w:r>
-              <w:t>Ship translations.</w:t>
-            </w:r>
-          </w:p>
-        </w:tc>
-        <w:tc>
-          <w:tcPr>
-            <w:tcW w:type="dxa" w:w="2160"/>
-          </w:tcPr>
-          <w:p>
-            <w:r>
-              <w:t>English-only.</w:t>
-            </w:r>
-          </w:p>
-        </w:tc>
-        <w:tc>
-          <w:tcPr>
-            <w:tcW w:type="dxa" w:w="2160"/>
-          </w:tcPr>
-          <w:p>
-            <w:r>
-              <w:t>Belgian operation; warehouse staff use Dutch/French.</w:t>
+              <w:t>English only</w:t>
             </w:r>
           </w:p>
         </w:tc>
@@ -867,7 +1955,7 @@
         <w:pStyle w:val="Heading1"/>
       </w:pPr>
       <w:r>
-        <w:t>4. Standard Odoo Mechanisms Reviewed</w:t>
+        <w:t>5. Standard Odoo Mechanisms Reviewed</w:t>
       </w:r>
     </w:p>
     <w:tbl>
@@ -926,7 +2014,7 @@
           </w:tcPr>
           <w:p>
             <w:r>
-              <w:t>package_use = "reusable": scanning a reusable box adds its products; the box is emptied afterwards and reused. Basis for D-11.</w:t>
+              <w:t>package_use="reusable": scanning adds contents; box emptied and reused. Basis for 4.8.</w:t>
             </w:r>
           </w:p>
         </w:tc>
@@ -948,7 +2036,7 @@
           </w:tcPr>
           <w:p>
             <w:r>
-              <w:t>_check_entire_pack attaches a DISPOSABLE box to the goods (it travels) but leaves a REUSABLE box behind (it stays and is reused). Basis for D-04.</w:t>
+              <w:t>_check_entire_pack attaches a DISPOSABLE box to the goods (travels) but leaves a REUSABLE box behind (stays, reused). Basis for 4.4.</w:t>
             </w:r>
           </w:p>
         </w:tc>
@@ -970,7 +2058,29 @@
           </w:tcPr>
           <w:p>
             <w:r>
-              <w:t>A package's quants carry lot_id; delivery/return are verified per serial/lot. Basis for D-03/D-05.</w:t>
+              <w:t>A package's quants carry lot_id; delivery/return verified per serial/lot. Basis for 4.3/4.9.</w:t>
+            </w:r>
+          </w:p>
+        </w:tc>
+      </w:tr>
+      <w:tr>
+        <w:tc>
+          <w:tcPr>
+            <w:tcW w:type="dxa" w:w="4320"/>
+          </w:tcPr>
+          <w:p>
+            <w:r>
+              <w:t>Usable packages in barcode</w:t>
+            </w:r>
+          </w:p>
+        </w:tc>
+        <w:tc>
+          <w:tcPr>
+            <w:tcW w:type="dxa" w:w="4320"/>
+          </w:tcPr>
+          <w:p>
+            <w:r>
+              <w:t>_get_usable_packages loads reusable / location-less packages into the barcode client.</w:t>
             </w:r>
           </w:p>
         </w:tc>
@@ -1036,7 +2146,7 @@
           </w:tcPr>
           <w:p>
             <w:r>
-              <w:t>No first-class object; standard practice is a tracked product (D-03).</w:t>
+              <w:t>No first-class object; standard practice is a tracked product (4.3).</w:t>
             </w:r>
           </w:p>
         </w:tc>
@@ -1047,7 +2157,7 @@
         <w:pStyle w:val="Heading1"/>
       </w:pPr>
       <w:r>
-        <w:t>5. Container &amp; Returnable-Packaging Model (final)</w:t>
+        <w:t>6. Container &amp; Returnable-Packaging Model (final)</w:t>
       </w:r>
     </w:p>
     <w:p>
@@ -1055,7 +2165,7 @@
         <w:pStyle w:val="ListBullet"/>
       </w:pPr>
       <w:r>
-        <w:t>The container is a generic stock.package; picking is reconciled against its ACTUAL contents (never a set). Contents may include serial/lot-tracked items (the crate) and untracked items (glasses).</w:t>
+        <w:t>The container is a generic stock.package; picking is reconciled against ACTUAL contents (never a set). Contents may include serial/lot-tracked items (the crate) and untracked items (glasses).</w:t>
       </w:r>
     </w:p>
     <w:p>
@@ -1063,7 +2173,7 @@
         <w:pStyle w:val="ListBullet"/>
       </w:pPr>
       <w:r>
-        <w:t>The returnable crate is a serial-tracked PRODUCT (Eurobak 40). Its serial is the durable, reusable identity: delivered to the client, returned, re-packed next cycle, counted like any product.</w:t>
+        <w:t>The returnable crate is a serial-tracked PRODUCT (Eurobak 40): delivered, returned, re-packed next cycle, counted like any product. Its serial is the durable, reusable identity.</w:t>
       </w:r>
     </w:p>
     <w:p>
@@ -1071,7 +2181,7 @@
         <w:pStyle w:val="ListBullet"/>
       </w:pPr>
       <w:r>
-        <w:t>Option (iii): at delivery the stock.package dissolves; the crate serial + glasses go to the client as products. The physical crate (the serial) provides the "travels + reused" behaviour; no traveling-package customization is required.</w:t>
+        <w:t>Option (iii): at delivery the stock.package dissolves; the crate serial + glasses go to the client as products. The physical crate (the serial) provides "travels + reused"; no traveling-package customisation.</w:t>
       </w:r>
     </w:p>
     <w:p>
@@ -1079,7 +2189,7 @@
         <w:pStyle w:val="ListBullet"/>
       </w:pPr>
       <w:r>
-        <w:t>Serial-scan is equivalent to package-scan: scanning the crate serial resolves to its current package and picks that package's actual contents.</w:t>
+        <w:t>Serial-scan equals package-scan: scanning the crate serial resolves to its current package and picks that package's actual contents.</w:t>
       </w:r>
     </w:p>
     <w:p>
@@ -1096,7 +2206,7 @@
           <w:b w:val="0"/>
           <w:i/>
         </w:rPr>
-        <w:t>Caveats (accepted): serial-scan only behaves as a "container" while the crate is actually packed; container-at-customer traceability is via the delivery record + serial, not a live package object; glasses are fungible so their return is verified by count while the crate is verified per-serial.</w:t>
+        <w:t>Accepted caveats: serial-scan only behaves as a "container" while the crate is actually packed; container-at-customer traceability is via the delivery record + serial (not a live package); glasses are fungible so their return is verified by count while the crate is verified per-serial.</w:t>
       </w:r>
     </w:p>
     <w:p>
@@ -1104,7 +2214,7 @@
         <w:pStyle w:val="Heading1"/>
       </w:pPr>
       <w:r>
-        <w:t>6. Functional Requirements</w:t>
+        <w:t>7. Functional Requirements</w:t>
       </w:r>
     </w:p>
     <w:tbl>
@@ -1187,7 +2297,7 @@
           </w:tcPr>
           <w:p>
             <w:r>
-              <w:t>On any picking, the user can scan a package barcode (Barcode app) or select it via a backend action to assign it. Native reusable package types make scan-adds-contents work; the rules below are layered on top.</w:t>
+              <w:t>On any picking, scan a package barcode or select it via a backend action to assign it; native reusable types make scan-adds-contents work, with the rules below layered on.</w:t>
             </w:r>
           </w:p>
         </w:tc>
@@ -1219,7 +2329,7 @@
           </w:tcPr>
           <w:p>
             <w:r>
-              <w:t>A package is eligible only if it is in (a sublocation of) the picking's source location — same rule as normal picking, for ALL locations.</w:t>
+              <w:t>Eligible only if the package is in (a sublocation of) the picking source location — same as normal picking, for ALL locations.</w:t>
             </w:r>
           </w:p>
         </w:tc>
@@ -1251,7 +2361,7 @@
           </w:tcPr>
           <w:p>
             <w:r>
-              <w:t>For each product in the package that matches an OPEN demand, fill the move-line done-qty from the package and stamp the source package (and its lot/serial for tracked items). Never create demand-0 lines. Reconcile by ACTUAL contents, never an inferred set.</w:t>
+              <w:t>Fill matching open-demand move-lines from the package (stamp source package + lot/serial). Never create demand-0 lines; never infer a set.</w:t>
             </w:r>
           </w:p>
         </w:tc>
@@ -1283,7 +2393,7 @@
           </w:tcPr>
           <w:p>
             <w:r>
-              <w:t>The scan never exceeds demand silently (fixes the "demand 0 / 40 / 80" doubling).</w:t>
+              <w:t>Never exceed demand silently (fixes the demand-0/40/80 doubling).</w:t>
             </w:r>
           </w:p>
         </w:tc>
@@ -1315,7 +2425,7 @@
           </w:tcPr>
           <w:p>
             <w:r>
-              <w:t>Accepted when every product+qty fits within remaining demand. If extra stock is genuinely required, the picker adds a line MANUALLY (explicit, never auto-pulled).</w:t>
+              <w:t>Accepted when contents fit within remaining demand; extra stock is added by the picker MANUALLY (explicit, never auto-pulled).</w:t>
             </w:r>
           </w:p>
         </w:tc>
@@ -1337,7 +2447,7 @@
           </w:tcPr>
           <w:p>
             <w:r>
-              <w:t>Overflow → ask to split</w:t>
+              <w:t>Overflow -&gt; ask to split</w:t>
             </w:r>
           </w:p>
         </w:tc>
@@ -1347,7 +2457,7 @@
           </w:tcPr>
           <w:p>
             <w:r>
-              <w:t>If the package holds MORE of a product than needed, prompt the picker to split: yes = consume up to demand and keep the remainder; no = reject. Splitting is real physical work and must be acknowledged.</w:t>
+              <w:t>More than needed -&gt; prompt to split (yes = up to demand, keep remainder; no = reject).</w:t>
             </w:r>
           </w:p>
         </w:tc>
@@ -1379,7 +2489,7 @@
           </w:tcPr>
           <w:p>
             <w:r>
-              <w:t>If the package covers only part of the demand, accept, fill what it can, and leave the rest open for another package or a loose pick.</w:t>
+              <w:t>Covers only part of demand -&gt; accept, fill what it can, leave rest open.</w:t>
             </w:r>
           </w:p>
         </w:tc>
@@ -1411,7 +2521,7 @@
           </w:tcPr>
           <w:p>
             <w:r>
-              <w:t>The zero-demand set header produces no barcode line and never blocks validation (Validate -&gt; button_validate, where _sanity_check neutralises it).</w:t>
+              <w:t>Zero-demand header never blocks validation.</w:t>
             </w:r>
           </w:p>
         </w:tc>
@@ -1443,7 +2553,7 @@
           </w:tcPr>
           <w:p>
             <w:r>
-              <w:t>Works on outbound, internal AND inbound operations (e.g. regroup returned products into packages before moving to stock). Not gated by operation type.</w:t>
+              <w:t>Outbound, internal AND inbound (e.g. regroup returns before stock).</w:t>
             </w:r>
           </w:p>
         </w:tc>
@@ -1465,7 +2575,7 @@
           </w:tcPr>
           <w:p>
             <w:r>
-              <w:t>Container lifecycle (Option iii)</w:t>
+              <w:t>Container lifecycle (iii)</w:t>
             </w:r>
           </w:p>
         </w:tc>
@@ -1475,7 +2585,7 @@
           </w:tcPr>
           <w:p>
             <w:r>
-              <w:t>The stock.package is warehouse-internal and dissolves at delivery. The serial-tracked container PRODUCT is the reusable, durable identity: delivered, returned, re-packed next cycle. Return verifies the crate per-serial and glasses by count.</w:t>
+              <w:t>Package dissolves at delivery; the serial-tracked product is the reusable identity; return verifies crate per-serial and glasses by count.</w:t>
             </w:r>
           </w:p>
         </w:tc>
@@ -1507,7 +2617,7 @@
           </w:tcPr>
           <w:p>
             <w:r>
-              <w:t>A backend "Assign prepared package" action applies the identical reconciliation/validation as the Barcode scan.</w:t>
+              <w:t>A backend action applies identical reconciliation/validation to the scan.</w:t>
             </w:r>
           </w:p>
         </w:tc>
@@ -1539,7 +2649,7 @@
           </w:tcPr>
           <w:p>
             <w:r>
-              <w:t>A barcode can be assigned to a SET; scanning it fills the set's DEFINED components (capped, with PPB-05/06 rules). No physical package needed. Separate from the container scan; does not pin specific serials.</w:t>
+              <w:t>Scanning a set barcode fills the set's DEFINED components (PPB-05/06 rules); no physical package; does not pin serials.</w:t>
             </w:r>
           </w:p>
         </w:tc>
@@ -1571,7 +2681,7 @@
           </w:tcPr>
           <w:p>
             <w:r>
-              <w:t>Scanning a tracked content's serial resolves to the package that currently holds it and picks that package's ACTUAL contents — the same result as scanning the package barcode.</w:t>
+              <w:t>Scanning a content serial resolves to its current package and picks that package's ACTUAL contents (= package scan).</w:t>
             </w:r>
           </w:p>
         </w:tc>
@@ -1603,7 +2713,7 @@
           </w:tcPr>
           <w:p>
             <w:r>
-              <w:t>All user-facing strings (errors, split prompt, action labels) are translatable; Dutch (nl) and French (fr) translations ship with the English source.</w:t>
+              <w:t>All user-facing strings translatable; nl &amp; fr ship with the en source.</w:t>
             </w:r>
           </w:p>
         </w:tc>
@@ -1614,7 +2724,7 @@
         <w:pStyle w:val="Heading1"/>
       </w:pPr>
       <w:r>
-        <w:t>7. Reconciliation Algorithm (scan/assign)</w:t>
+        <w:t>8. Reconciliation Algorithm (scan/assign)</w:t>
       </w:r>
     </w:p>
     <w:p>
@@ -1622,7 +2732,7 @@
         <w:pStyle w:val="ListNumber"/>
       </w:pPr>
       <w:r>
-        <w:t>Resolve the scanned barcode: a package -&gt; that package; a content serial -&gt; the package holding it (PPB-13); a set barcode -&gt; the set's defined components (PPB-12). Verify PPB-02 location.</w:t>
+        <w:t>Resolve the scanned barcode: package -&gt; that package; content serial -&gt; the package holding it (PPB-13); set barcode -&gt; the set's defined components (PPB-12). Verify PPB-02 location.</w:t>
       </w:r>
     </w:p>
     <w:p>
@@ -1630,7 +2740,7 @@
         <w:pStyle w:val="ListNumber"/>
       </w:pPr>
       <w:r>
-        <w:t>Read contents as product -&gt; qty (actual package contents, or set components for PPB-12), including lot/serial for tracked items.</w:t>
+        <w:t>Read contents as product -&gt; qty (actual contents, or set components), incl. lot/serial.</w:t>
       </w:r>
     </w:p>
     <w:p>
@@ -1638,7 +2748,7 @@
         <w:pStyle w:val="ListNumber"/>
       </w:pPr>
       <w:r>
-        <w:t>Compute remaining demand per product on this picking (open moves).</w:t>
+        <w:t>Compute remaining demand per product (open moves).</w:t>
       </w:r>
     </w:p>
     <w:p>
@@ -1646,7 +2756,7 @@
         <w:pStyle w:val="ListNumber"/>
       </w:pPr>
       <w:r>
-        <w:t>For each product: if package_qty &lt;= remaining_demand -&gt; apply (fill move-line, cap at demand, stamp source package + lot/serial). If a product is not demanded at all -&gt; reject with a clear message (add manually per PPB-05 if truly needed).</w:t>
+        <w:t>For each product: package_qty &lt;= remaining_demand -&gt; apply (fill, cap, stamp package+lot/serial); product not demanded -&gt; reject with a clear message (add manually per PPB-05).</w:t>
       </w:r>
     </w:p>
     <w:p>
@@ -1654,7 +2764,7 @@
         <w:pStyle w:val="ListNumber"/>
       </w:pPr>
       <w:r>
-        <w:t>If package_qty &gt; remaining_demand for some product -&gt; prompt "split the package?" (PPB-06).</w:t>
+        <w:t>package_qty &gt; remaining_demand -&gt; prompt "split the package?" (PPB-06).</w:t>
       </w:r>
     </w:p>
     <w:p>
@@ -1662,7 +2772,7 @@
         <w:pStyle w:val="ListNumber"/>
       </w:pPr>
       <w:r>
-        <w:t>Leave the zero-demand set header untouched; proceed to button_validate; partial demand stays open.</w:t>
+        <w:t>Leave the zero-demand header untouched; proceed to button_validate; partial demand stays open.</w:t>
       </w:r>
     </w:p>
     <w:p>
@@ -1670,7 +2780,7 @@
         <w:pStyle w:val="Heading1"/>
       </w:pPr>
       <w:r>
-        <w:t>8. Acceptance Test Scenarios</w:t>
+        <w:t>9. Acceptance Test Scenarios</w:t>
       </w:r>
     </w:p>
     <w:tbl>
@@ -1753,7 +2863,7 @@
           </w:tcPr>
           <w:p>
             <w:r>
-              <w:t>Package = exact demand -&gt; fills all moves, no overflow, validates.</w:t>
+              <w:t>Fills all moves, no overflow, validates.</w:t>
             </w:r>
           </w:p>
         </w:tc>
@@ -1785,7 +2895,7 @@
           </w:tcPr>
           <w:p>
             <w:r>
-              <w:t>Same on Pick-&gt;Pack-&gt;Ship -&gt; works each step.</w:t>
+              <w:t>Works on each Pick-&gt;Pack-&gt;Ship step.</w:t>
             </w:r>
           </w:p>
         </w:tc>
@@ -1817,7 +2927,7 @@
           </w:tcPr>
           <w:p>
             <w:r>
-              <w:t>Package has a product not demanded -&gt; rejected; picker may add a line manually.</w:t>
+              <w:t>Rejected; picker may add a line manually.</w:t>
             </w:r>
           </w:p>
         </w:tc>
@@ -1839,7 +2949,7 @@
           </w:tcPr>
           <w:p>
             <w:r>
-              <w:t>Quantity overflow -&gt; split prompt</w:t>
+              <w:t>Quantity overflow</w:t>
             </w:r>
           </w:p>
         </w:tc>
@@ -1849,7 +2959,7 @@
           </w:tcPr>
           <w:p>
             <w:r>
-              <w:t>More of a product than needed -&gt; picker asked to split.</w:t>
+              <w:t>Picker prompted to split.</w:t>
             </w:r>
           </w:p>
         </w:tc>
@@ -1881,7 +2991,7 @@
           </w:tcPr>
           <w:p>
             <w:r>
-              <w:t>Fewer than demanded -&gt; accepted, remainder open.</w:t>
+              <w:t>Accepted; remainder open.</w:t>
             </w:r>
           </w:p>
         </w:tc>
@@ -1913,7 +3023,7 @@
           </w:tcPr>
           <w:p>
             <w:r>
-              <w:t>Package outside the picking source -&gt; ineligible.</w:t>
+              <w:t>Ineligible.</w:t>
             </w:r>
           </w:p>
         </w:tc>
@@ -1945,7 +3055,7 @@
           </w:tcPr>
           <w:p>
             <w:r>
-              <w:t>Zero-demand header never blocks validation.</w:t>
+              <w:t>Never blocks validation.</w:t>
             </w:r>
           </w:p>
         </w:tc>
@@ -1977,7 +3087,7 @@
           </w:tcPr>
           <w:p>
             <w:r>
-              <w:t>On inbound/internal, scanning regroups products into a package.</w:t>
+              <w:t>Scanning regroups products into a package on inbound/internal.</w:t>
             </w:r>
           </w:p>
         </w:tc>
@@ -2009,7 +3119,7 @@
           </w:tcPr>
           <w:p>
             <w:r>
-              <w:t>Scanning a set barcode fills the set's defined components (PPB-12).</w:t>
+              <w:t>Fills the set's defined components.</w:t>
             </w:r>
           </w:p>
         </w:tc>
@@ -2041,7 +3151,7 @@
           </w:tcPr>
           <w:p>
             <w:r>
-              <w:t>Scanning a crate serial picks its current package's contents (PPB-13).</w:t>
+              <w:t>Picks the crate's current package contents.</w:t>
             </w:r>
           </w:p>
         </w:tc>
@@ -2073,7 +3183,7 @@
           </w:tcPr>
           <w:p>
             <w:r>
-              <w:t>Crate serial recorded on delivery; return reconciles serial back + glasses by count.</w:t>
+              <w:t>Serial recorded on delivery; return reconciles serial + glasses.</w:t>
             </w:r>
           </w:p>
         </w:tc>
@@ -2105,7 +3215,7 @@
           </w:tcPr>
           <w:p>
             <w:r>
-              <w:t>Error and split-prompt strings appear translated in nl/fr.</w:t>
+              <w:t>Error and split-prompt strings translated in nl/fr.</w:t>
             </w:r>
           </w:p>
         </w:tc>
@@ -2117,7 +3227,7 @@
           <w:b w:val="0"/>
           <w:i/>
         </w:rPr>
-        <w:t>Today's suite has no physical-package coverage; T-01..T-12 add it.</w:t>
+        <w:t>Note on existing coverage gaps (rationale for the new tests): today's rental_set suite has NO physical-package tests; its multi-step tests select the warehouse via search([],limit=1) (may miss the order's warehouse in a multi-warehouse DB) and contain silent early-returns that can pass without asserting. T-01..T-12 close these gaps.</w:t>
       </w:r>
     </w:p>
     <w:p>
@@ -2125,7 +3235,7 @@
         <w:pStyle w:val="Heading1"/>
       </w:pPr>
       <w:r>
-        <w:t>9. Module Architecture</w:t>
+        <w:t>10. Module Architecture</w:t>
       </w:r>
     </w:p>
     <w:p>
@@ -2133,7 +3243,7 @@
         <w:pStyle w:val="ListBullet"/>
       </w:pPr>
       <w:r>
-        <w:t>Single module rental_scanning, depending only on stock_barcode (+ composes with rental_set). Home for all future scanning work.</w:t>
+        <w:t>Single module rental_scanning, depending only on stock_barcode (+ composes with rental_set).</w:t>
       </w:r>
     </w:p>
     <w:p>
@@ -2141,7 +3251,7 @@
         <w:pStyle w:val="ListBullet"/>
       </w:pPr>
       <w:r>
-        <w:t>Reuse native reusable package types for scan-adds-contents and box freeing; the module adds the strict-fit rules, the split prompt, serial-scan resolution, the set barcode, and set composition.</w:t>
+        <w:t>Reuse native reusable package types; the module adds strict-fit rules, the split prompt, serial-scan resolution, the set barcode, and set composition.</w:t>
       </w:r>
     </w:p>
     <w:p>
@@ -2149,7 +3259,7 @@
         <w:pStyle w:val="ListBullet"/>
       </w:pPr>
       <w:r>
-        <w:t>Interference: keep improvements that patch the SAME barcode JS method (e.g. _processPackage) in this one module and compose them in a single patch; always call super().</w:t>
+        <w:t>Keep improvements that patch the SAME barcode JS method (e.g. _processPackage) in this one module and compose them in a single patch; always call super().</w:t>
       </w:r>
     </w:p>
     <w:p>
@@ -2157,7 +3267,63 @@
         <w:pStyle w:val="Heading1"/>
       </w:pPr>
       <w:r>
-        <w:t>10. Scope Boundaries</w:t>
+        <w:t>11. Technical Findings (appendix, for implementers)</w:t>
+      </w:r>
+    </w:p>
+    <w:p>
+      <w:pPr>
+        <w:pStyle w:val="ListBullet"/>
+      </w:pPr>
+      <w:r>
+        <w:t>Barcode payload sends all move_ids, but the client builds display LINES from move_line_ids; a zero-demand header move has no move-line, so it renders no line.</w:t>
+      </w:r>
+    </w:p>
+    <w:p>
+      <w:pPr>
+        <w:pStyle w:val="ListBullet"/>
+      </w:pPr>
+      <w:r>
+        <w:t>Validate uses button_validate (validateMethod), so the rental_set _sanity_check override applies and neutralises the zero-demand header.</w:t>
+      </w:r>
+    </w:p>
+    <w:p>
+      <w:pPr>
+        <w:pStyle w:val="ListBullet"/>
+      </w:pPr>
+      <w:r>
+        <w:t>_processPackage: if no existing line is linked to the scanned package, it creates a line per quant -&gt; the overflow source; rental_scanning must instead reconcile against existing demand.</w:t>
+      </w:r>
+    </w:p>
+    <w:p>
+      <w:pPr>
+        <w:pStyle w:val="ListBullet"/>
+      </w:pPr>
+      <w:r>
+        <w:t>_moveEntirePackage() returns picking_type_entire_packs (the "Move Entire Packages" flag).</w:t>
+      </w:r>
+    </w:p>
+    <w:p>
+      <w:pPr>
+        <w:pStyle w:val="ListBullet"/>
+      </w:pPr>
+      <w:r>
+        <w:t>_check_entire_pack: reusable boxes are not set as result_package (stay behind); disposable boxes become the result_package (travel).</w:t>
+      </w:r>
+    </w:p>
+    <w:p>
+      <w:pPr>
+        <w:pStyle w:val="ListBullet"/>
+      </w:pPr>
+      <w:r>
+        <w:t>_get_usable_packages loads reusable / location-less packages into the client cache.</w:t>
+      </w:r>
+    </w:p>
+    <w:p>
+      <w:pPr>
+        <w:pStyle w:val="Heading1"/>
+      </w:pPr>
+      <w:r>
+        <w:t>12. Scope Boundaries</w:t>
       </w:r>
     </w:p>
     <w:p>
@@ -2223,7 +3389,7 @@
         <w:pStyle w:val="ListBullet"/>
       </w:pPr>
       <w:r>
-        <w:t>Sales/Website/Kiosk visibility — this is a warehouse-only concept.</w:t>
+        <w:t>Sales/Website/Kiosk visibility — warehouse-only concept.</w:t>
       </w:r>
     </w:p>
     <w:p>
@@ -2231,7 +3397,7 @@
         <w:pStyle w:val="ListBullet"/>
       </w:pPr>
       <w:r>
-        <w:t>A new product for the package, or package-ID=serial coupling — rejected (D-03).</w:t>
+        <w:t>A new product for the package, or package-ID=serial coupling — rejected (4.3).</w:t>
       </w:r>
     </w:p>
     <w:p>
@@ -2239,7 +3405,7 @@
         <w:pStyle w:val="ListBullet"/>
       </w:pPr>
       <w:r>
-        <w:t>A custom reusable-label metadata field — rejected (D-11); native types suffice.</w:t>
+        <w:t>A custom reusable-label metadata field — rejected (4.8); native types suffice.</w:t>
       </w:r>
     </w:p>
     <w:p>
@@ -2247,7 +3413,7 @@
         <w:pStyle w:val="ListBullet"/>
       </w:pPr>
       <w:r>
-        <w:t>Making a package physically travel (Option ii) — rejected (D-04) in favour of the serial.</w:t>
+        <w:t>Making a package physically travel (Option ii) — rejected (4.4) in favour of the serial.</w:t>
       </w:r>
     </w:p>
     <w:sectPr>

</xml_diff>

<commit_message>
docs: clarify loose-serial fallback + add partial/backorder & loose-serial tests (v5)
- PPB-13: scanning a package-product serial that is NOT in a package falls
  back to standard single-serial behaviour (only that product added).
- Add T-13 (loose serial, not packed) and T-14 (partial delivery + backorder:
  demand carry-over, header re-creation on backorder, reconciliation).

Co-Authored-By: Claude Opus 4.8 <noreply@anthropic.com>
Claude-Session: https://claude.ai/code/session_015UyktmijNHjiCtQB359rzX
</commit_message>
<xml_diff>
--- a/docs/rental_scanning_requirements.docx
+++ b/docs/rental_scanning_requirements.docx
@@ -18,7 +18,7 @@
           <w:color w:val="1F497D"/>
           <w:sz w:val="26"/>
         </w:rPr>
-        <w:t>Functional &amp; Technical Requirements — Backend / Inventory + Barcode (v4, FINAL)</w:t>
+        <w:t>Functional &amp; Technical Requirements — Backend / Inventory + Barcode (v5, FINAL)</w:t>
       </w:r>
     </w:p>
     <w:tbl>
@@ -295,7 +295,7 @@
         <w:pStyle w:val="ListBullet"/>
       </w:pPr>
       <w:r>
-        <w:t>Separately confirmed NOT to be the cause: the rental-set logic is not gated by operation type (it works on all outbound steps), and the zero-demand set header is barcode-safe (it has no move-line, so it produces no barcode line and never blocks button_validate, where the rental_set _sanity_check override neutralises it).</w:t>
+        <w:t>Separately confirmed NOT to be the cause: the rental-set logic is not gated by operation type (it works on all outbound steps), and the zero-demand set header is barcode-safe (no move-line, so no barcode line, and it never blocks button_validate, where the rental_set _sanity_check override neutralises it).</w:t>
       </w:r>
     </w:p>
     <w:p>
@@ -963,7 +963,7 @@
         <w:pStyle w:val="ListBullet"/>
       </w:pPr>
       <w:r>
-        <w:t>No live "package at customer" object — container-at-customer traceability is via the delivery record + serial.</w:t>
+        <w:t>No live "package at customer" object — traceability is via the delivery record + serial.</w:t>
       </w:r>
     </w:p>
     <w:p>
@@ -1517,7 +1517,7 @@
         <w:pStyle w:val="ListBullet"/>
       </w:pPr>
       <w:r>
-        <w:t>Serial-scan is equivalent to package-scan (PPB-13): scanning a content serial resolves to the package holding it and picks that package's actual contents. Chosen because it is contents-driven (truthful) and uses a native serial-&gt;package lookup; the alternative (serial drives a set) was rejected in 4.2.</w:t>
+        <w:t>Serial-scan is equivalent to package-scan (PPB-13): scanning a content serial resolves to the package holding it and picks that package's actual contents. If the serial is NOT in a package, it falls back to a standard single-serial scan (only that product is added). Chosen because it is contents-driven (truthful) and uses a native serial-&gt;package lookup; the alternative (serial drives a set) was rejected in 4.2.</w:t>
       </w:r>
     </w:p>
     <w:p>
@@ -1870,7 +1870,7 @@
           </w:tcPr>
           <w:p>
             <w:r>
-              <w:t>Serial-scan = package-scan</w:t>
+              <w:t>Serial-scan = package-scan (loose serial = standard)</w:t>
             </w:r>
           </w:p>
         </w:tc>
@@ -2080,7 +2080,7 @@
           </w:tcPr>
           <w:p>
             <w:r>
-              <w:t>_get_usable_packages loads reusable / location-less packages into the barcode client.</w:t>
+              <w:t>_get_usable_packages loads reusable / location-less packages into the client.</w:t>
             </w:r>
           </w:p>
         </w:tc>
@@ -2189,7 +2189,7 @@
         <w:pStyle w:val="ListBullet"/>
       </w:pPr>
       <w:r>
-        <w:t>Serial-scan equals package-scan: scanning the crate serial resolves to its current package and picks that package's actual contents.</w:t>
+        <w:t>Serial-scan equals package-scan: scanning the crate serial resolves to its current package and picks that package's actual contents. If the crate serial is NOT in a package, scanning it adds only that crate (standard single-serial behaviour) - no container/set expansion.</w:t>
       </w:r>
     </w:p>
     <w:p>
@@ -2489,7 +2489,7 @@
           </w:tcPr>
           <w:p>
             <w:r>
-              <w:t>Covers only part of demand -&gt; accept, fill what it can, leave rest open.</w:t>
+              <w:t>Covers only part of demand -&gt; accept, fill what it can, leave rest open (a backorder carries the remaining demand).</w:t>
             </w:r>
           </w:p>
         </w:tc>
@@ -2671,7 +2671,7 @@
           </w:tcPr>
           <w:p>
             <w:r>
-              <w:t>Serial-scan -&gt; container</w:t>
+              <w:t>Serial-scan -&gt; container (with fallback)</w:t>
             </w:r>
           </w:p>
         </w:tc>
@@ -2681,7 +2681,7 @@
           </w:tcPr>
           <w:p>
             <w:r>
-              <w:t>Scanning a content serial resolves to its current package and picks that package's ACTUAL contents (= package scan).</w:t>
+              <w:t>Scanning a content serial resolves to its current package and picks that package's ACTUAL contents (= package scan). If the serial's product is NOT currently in a package, it falls back to STANDARD behaviour: only that one product/serial is added, nothing else (no container/set expansion).</w:t>
             </w:r>
           </w:p>
         </w:tc>
@@ -2732,7 +2732,7 @@
         <w:pStyle w:val="ListNumber"/>
       </w:pPr>
       <w:r>
-        <w:t>Resolve the scanned barcode: package -&gt; that package; content serial -&gt; the package holding it (PPB-13); set barcode -&gt; the set's defined components (PPB-12). Verify PPB-02 location.</w:t>
+        <w:t>Resolve the scanned barcode: package -&gt; that package; content serial -&gt; the package holding it (PPB-13) or, if the serial is NOT in any package, just that single product/serial (standard); set barcode -&gt; the set's defined components (PPB-12). Verify PPB-02 location.</w:t>
       </w:r>
     </w:p>
     <w:p>
@@ -2772,7 +2772,7 @@
         <w:pStyle w:val="ListNumber"/>
       </w:pPr>
       <w:r>
-        <w:t>Leave the zero-demand header untouched; proceed to button_validate; partial demand stays open.</w:t>
+        <w:t>Leave the zero-demand header untouched; proceed to button_validate; partial demand -&gt; backorder.</w:t>
       </w:r>
     </w:p>
     <w:p>
@@ -3220,6 +3220,70 @@
           </w:p>
         </w:tc>
       </w:tr>
+      <w:tr>
+        <w:tc>
+          <w:tcPr>
+            <w:tcW w:type="dxa" w:w="2880"/>
+          </w:tcPr>
+          <w:p>
+            <w:r>
+              <w:t>T-13</w:t>
+            </w:r>
+          </w:p>
+        </w:tc>
+        <w:tc>
+          <w:tcPr>
+            <w:tcW w:type="dxa" w:w="2880"/>
+          </w:tcPr>
+          <w:p>
+            <w:r>
+              <w:t>Loose serial (not packed)</w:t>
+            </w:r>
+          </w:p>
+        </w:tc>
+        <w:tc>
+          <w:tcPr>
+            <w:tcW w:type="dxa" w:w="2880"/>
+          </w:tcPr>
+          <w:p>
+            <w:r>
+              <w:t>Scanning a package-product serial that is NOT inside any package adds only that one product/serial (standard) - no container/set expansion (PPB-13).</w:t>
+            </w:r>
+          </w:p>
+        </w:tc>
+      </w:tr>
+      <w:tr>
+        <w:tc>
+          <w:tcPr>
+            <w:tcW w:type="dxa" w:w="2880"/>
+          </w:tcPr>
+          <w:p>
+            <w:r>
+              <w:t>T-14</w:t>
+            </w:r>
+          </w:p>
+        </w:tc>
+        <w:tc>
+          <w:tcPr>
+            <w:tcW w:type="dxa" w:w="2880"/>
+          </w:tcPr>
+          <w:p>
+            <w:r>
+              <w:t>Partial delivery + backorder</w:t>
+            </w:r>
+          </w:p>
+        </w:tc>
+        <w:tc>
+          <w:tcPr>
+            <w:tcW w:type="dxa" w:w="2880"/>
+          </w:tcPr>
+          <w:p>
+            <w:r>
+              <w:t>A package (or set/serial scan) covers only PART of a delivery: validate creates a backorder with the remaining demand; the set header is recreated on the backorder; no overflow; scanning the rest on the backorder completes it. Verifies partial fulfilment, backorder demand carry-over, header re-creation and reconciliation together.</w:t>
+            </w:r>
+          </w:p>
+        </w:tc>
+      </w:tr>
     </w:tbl>
     <w:p>
       <w:r>
@@ -3227,7 +3291,7 @@
           <w:b w:val="0"/>
           <w:i/>
         </w:rPr>
-        <w:t>Note on existing coverage gaps (rationale for the new tests): today's rental_set suite has NO physical-package tests; its multi-step tests select the warehouse via search([],limit=1) (may miss the order's warehouse in a multi-warehouse DB) and contain silent early-returns that can pass without asserting. T-01..T-12 close these gaps.</w:t>
+        <w:t>Note on existing coverage gaps (rationale for the new tests): today's rental_set suite has NO physical-package tests; its multi-step tests select the warehouse via search([],limit=1) (may miss the order's warehouse in a multi-warehouse DB) and contain silent early-returns that can pass without asserting. T-01..T-14 close these gaps.</w:t>
       </w:r>
     </w:p>
     <w:p>
@@ -3251,7 +3315,7 @@
         <w:pStyle w:val="ListBullet"/>
       </w:pPr>
       <w:r>
-        <w:t>Reuse native reusable package types; the module adds strict-fit rules, the split prompt, serial-scan resolution, the set barcode, and set composition.</w:t>
+        <w:t>Reuse native reusable package types; the module adds strict-fit rules, the split prompt, serial-scan resolution (with loose-serial fallback), the set barcode, and set composition.</w:t>
       </w:r>
     </w:p>
     <w:p>
@@ -3348,7 +3412,7 @@
         <w:pStyle w:val="ListBullet"/>
       </w:pPr>
       <w:r>
-        <w:t>Strict-fit reconciliation with split prompt; serial/lot handling; multilingual.</w:t>
+        <w:t>Strict-fit reconciliation with split prompt; serial/lot handling; loose-serial fallback; multilingual.</w:t>
       </w:r>
     </w:p>
     <w:p>
@@ -3356,7 +3420,7 @@
         <w:pStyle w:val="ListBullet"/>
       </w:pPr>
       <w:r>
-        <w:t>All routes; set-header no-op; ad-hoc and pre-prepared containers.</w:t>
+        <w:t>All routes; set-header no-op; ad-hoc and pre-prepared containers; partial + backorder.</w:t>
       </w:r>
     </w:p>
     <w:p>

</xml_diff>

<commit_message>
rental_scanning: remove/unassign package (PPB-15) + package visibility (PPB-16)
- stock.picking.rental_scanning_package_ids (Scanned Packages) shown on the
  form so an applied source package is visible at a glance (Q1).
- rental_scanning_remove_package() + 'Remove Scanned Package' wizard/action
  to clear a scanned package and revert its qty to open demand (PPB-15, no
  replace). Enables the partial->full swap cleanly.
- Tests T-17 (remove) and T-18 (swap partial for full).
- Requirements doc: addendum v6 (PPB-15/16, source-vs-result packages,
  Put-in-Pack, Option iii reconfirmed).

Co-Authored-By: Claude Opus 4.8 <noreply@anthropic.com>
Claude-Session: https://claude.ai/code/session_015UyktmijNHjiCtQB359rzX
</commit_message>
<xml_diff>
--- a/docs/rental_scanning_requirements.docx
+++ b/docs/rental_scanning_requirements.docx
@@ -3480,6 +3480,144 @@
         <w:t>Making a package physically travel (Option ii) — rejected (4.4) in favour of the serial.</w:t>
       </w:r>
     </w:p>
+    <w:p>
+      <w:pPr>
+        <w:pStyle w:val="Heading1"/>
+      </w:pPr>
+      <w:r>
+        <w:t>13. Addendum v6 — Remove/Unassign, Package Visibility, Put-in-Pack</w:t>
+      </w:r>
+    </w:p>
+    <w:p>
+      <w:r>
+        <w:rPr>
+          <w:b w:val="0"/>
+          <w:i w:val="0"/>
+        </w:rPr>
+        <w:t>Follows live testing on PRO/OUT/00004. Adds two requirements and clarifies the source-vs-result package model. Reconfirms Option (iii).</w:t>
+      </w:r>
+    </w:p>
+    <w:p>
+      <w:pPr>
+        <w:pStyle w:val="Heading2"/>
+      </w:pPr>
+      <w:r>
+        <w:t>13.1 PPB-15 — Remove / unassign a scanned package</w:t>
+      </w:r>
+    </w:p>
+    <w:p>
+      <w:pPr>
+        <w:pStyle w:val="ListBullet"/>
+      </w:pPr>
+      <w:r>
+        <w:t>A previously scanned package can be removed from a transfer: the picked move-lines sourced from that package are cleared, reverting that quantity to OPEN demand, so a different package can be scanned instead.</w:t>
+      </w:r>
+    </w:p>
+    <w:p>
+      <w:pPr>
+        <w:pStyle w:val="ListBullet"/>
+      </w:pPr>
+      <w:r>
+        <w:t>No "replace" convenience (by decision): to swap, remove then scan the new package. This keeps the behaviour explicit.</w:t>
+      </w:r>
+    </w:p>
+    <w:p>
+      <w:pPr>
+        <w:pStyle w:val="ListBullet"/>
+      </w:pPr>
+      <w:r>
+        <w:t>Backend: "Remove Scanned Package" action on the picking (visible only when a scanned package is present). Barcode scan-to-remove is Phase 2.</w:t>
+      </w:r>
+    </w:p>
+    <w:p>
+      <w:r>
+        <w:rPr>
+          <w:b w:val="0"/>
+          <w:i/>
+        </w:rPr>
+        <w:t>Rationale: scanning is idempotent PER package, but a partial package (e.g. BAK02 = 35 of 40) leaves 5 open; scanning a full package (BAK01) afterwards would only top-up the 5 (mixed sources). Removing first gives a clean single-source pick. Rejected: an implicit "replace" (hidden, harder to reason about).</w:t>
+      </w:r>
+    </w:p>
+    <w:p>
+      <w:pPr>
+        <w:pStyle w:val="Heading2"/>
+      </w:pPr>
+      <w:r>
+        <w:t>13.2 PPB-16 — Package visibility &amp; source-vs-result packages</w:t>
+      </w:r>
+    </w:p>
+    <w:p>
+      <w:pPr>
+        <w:pStyle w:val="ListBullet"/>
+      </w:pPr>
+      <w:r>
+        <w:t>Applied SOURCE packages are shown on the picking via a "Scanned Packages" field (many2many tags). The Operations move list shows product/demand/qty; the per-line source package is only in the detailed move-lines — hence the picking-level field for at-a-glance visibility.</w:t>
+      </w:r>
+    </w:p>
+    <w:p>
+      <w:pPr>
+        <w:pStyle w:val="ListBullet"/>
+      </w:pPr>
+      <w:r>
+        <w:t>Prepared packages (BAK01/02) are SOURCE packages you pick FROM (set as the move-line package_id).</w:t>
+      </w:r>
+    </w:p>
+    <w:p>
+      <w:pPr>
+        <w:pStyle w:val="ListBullet"/>
+      </w:pPr>
+      <w:r>
+        <w:t>"Put the whole operation in one pack, then just scan that pack at checkout" = native Odoo Put-in-Pack, which builds ONE result/destination package; in a multi-step flow the next step scans that single package and the reconciliation fills it. Source scan and result Put-in-Pack are complementary.</w:t>
+      </w:r>
+    </w:p>
+    <w:p>
+      <w:pPr>
+        <w:pStyle w:val="ListBullet"/>
+      </w:pPr>
+      <w:r>
+        <w:t>Option (iii) reconfirmed: at the FINAL customer delivery the pack dissolves (goods leave as products; the crate travels as a serial-tracked product). "One pack to scan" is therefore ideal for internal handoffs (Pick/Pack/Ship), not retained at the customer.</w:t>
+      </w:r>
+    </w:p>
+    <w:p>
+      <w:pPr>
+        <w:pStyle w:val="Heading2"/>
+      </w:pPr>
+      <w:r>
+        <w:t>13.3 Additional acceptance tests</w:t>
+      </w:r>
+    </w:p>
+    <w:p>
+      <w:pPr>
+        <w:pStyle w:val="ListBullet"/>
+      </w:pPr>
+      <w:r>
+        <w:t>T-15 Reserved picking: scanning works when the picking is already reserved (move.quantity == demand, picked=False) — regression from live testing.</w:t>
+      </w:r>
+    </w:p>
+    <w:p>
+      <w:pPr>
+        <w:pStyle w:val="ListBullet"/>
+      </w:pPr>
+      <w:r>
+        <w:t>T-16 Idempotent re-scan: scanning the same package twice does not double.</w:t>
+      </w:r>
+    </w:p>
+    <w:p>
+      <w:pPr>
+        <w:pStyle w:val="ListBullet"/>
+      </w:pPr>
+      <w:r>
+        <w:t>T-17 Remove: removing a scanned package reverts its quantity to open demand.</w:t>
+      </w:r>
+    </w:p>
+    <w:p>
+      <w:pPr>
+        <w:pStyle w:val="ListBullet"/>
+      </w:pPr>
+      <w:r>
+        <w:t>T-18 Swap: remove a partial package, scan a full one -&gt; single-source fill.</w:t>
+      </w:r>
+    </w:p>
     <w:sectPr>
       <w:pgSz w:w="12240" w:h="15840"/>
       <w:pgMar w:top="1440" w:right="1800" w:bottom="1440" w:left="1800" w:header="720" w:footer="720" w:gutter="0"/>

</xml_diff>

<commit_message>
rental_scanning: PPB-17 retain package through internal steps + nested pack support
- _rs_place: on moves whose destination is INTERNAL, set result_package_id
  = scanned package so it travels and can be re-scanned at the follow-up
  step; at CUSTOMER destinations leave it dissolved (Option iii).
- Content extraction now carries each quant's actual (innermost) source
  package, so scanning a nested/general pack stamps the right source and
  fulfils demand from nested children (contained_quant_ids).
- Tests: T-19 nested general pack; PPB-17 internal-retains / customer-dissolves.
- Doc addendum v7. Version 19.0.1.2.0.

Co-Authored-By: Claude Opus 4.8 <noreply@anthropic.com>
Claude-Session: https://claude.ai/code/session_015UyktmijNHjiCtQB359rzX
</commit_message>
<xml_diff>
--- a/docs/rental_scanning_requirements.docx
+++ b/docs/rental_scanning_requirements.docx
@@ -3618,6 +3618,118 @@
         <w:t>T-18 Swap: remove a partial package, scan a full one -&gt; single-source fill.</w:t>
       </w:r>
     </w:p>
+    <w:p>
+      <w:pPr>
+        <w:pStyle w:val="Heading1"/>
+      </w:pPr>
+      <w:r>
+        <w:t>14. Addendum v7 — PPB-17 (retain through internal steps) + nested packs</w:t>
+      </w:r>
+    </w:p>
+    <w:p>
+      <w:r>
+        <w:rPr>
+          <w:i w:val="0"/>
+        </w:rPr>
+        <w:t>Answers "can I scan the package again at the follow-up warehouse step?"</w:t>
+      </w:r>
+    </w:p>
+    <w:p>
+      <w:pPr>
+        <w:pStyle w:val="Heading2"/>
+      </w:pPr>
+      <w:r>
+        <w:t>14.1 PPB-17 — retain the scanned package through internal steps</w:t>
+      </w:r>
+    </w:p>
+    <w:p>
+      <w:pPr>
+        <w:pStyle w:val="ListBullet"/>
+      </w:pPr>
+      <w:r>
+        <w:t>When a scanned package fills a move whose DESTINATION is an internal location (Pick-&gt;Output, Pack-&gt;...), the scanned package is set as the RESULT (destination) package, so the goods travel inside it and it can be re-scanned at the next step.</w:t>
+      </w:r>
+    </w:p>
+    <w:p>
+      <w:pPr>
+        <w:pStyle w:val="ListBullet"/>
+      </w:pPr>
+      <w:r>
+        <w:t>When the destination is the CUSTOMER (final delivery), no result package is set -&gt; the pack dissolves and goods ship as products (Option iii reconfirmed: "dissolve at delivery" = at the customer, not internal handoffs).</w:t>
+      </w:r>
+    </w:p>
+    <w:p>
+      <w:pPr>
+        <w:pStyle w:val="ListBullet"/>
+      </w:pPr>
+      <w:r>
+        <w:t>Side effect: at internal steps the native "Packages" column now shows the pack (it has a result package); at the customer delivery it stays empty.</w:t>
+      </w:r>
+    </w:p>
+    <w:p>
+      <w:pPr>
+        <w:pStyle w:val="Heading2"/>
+      </w:pPr>
+      <w:r>
+        <w:t>14.2 Nested / general packs (Path A) — supported natively</w:t>
+      </w:r>
+    </w:p>
+    <w:p>
+      <w:pPr>
+        <w:pStyle w:val="ListBullet"/>
+      </w:pPr>
+      <w:r>
+        <w:t>Odoo supports package-in-package (parent_package_id, contained_quant_ids aggregates all nested children). Our scan reads contained_quant_ids, so scanning a general/outer pack fulfils demand from nested packages (e.g. BAK01 inside a GENERAL pack).</w:t>
+      </w:r>
+    </w:p>
+    <w:p>
+      <w:pPr>
+        <w:pStyle w:val="ListBullet"/>
+      </w:pPr>
+      <w:r>
+        <w:t>Each line is stamped with the quant's ACTUAL (innermost) source package, not the outer one, so traceability stays correct.</w:t>
+      </w:r>
+    </w:p>
+    <w:p>
+      <w:pPr>
+        <w:pStyle w:val="ListBullet"/>
+      </w:pPr>
+      <w:r>
+        <w:t>Put-in-Pack sets a result package that travels downstream, so consolidating into a general pack and scanning it at the next step also works natively.</w:t>
+      </w:r>
+    </w:p>
+    <w:p>
+      <w:pPr>
+        <w:pStyle w:val="Heading2"/>
+      </w:pPr>
+      <w:r>
+        <w:t>14.3 Tests added</w:t>
+      </w:r>
+    </w:p>
+    <w:p>
+      <w:pPr>
+        <w:pStyle w:val="ListBullet"/>
+      </w:pPr>
+      <w:r>
+        <w:t>T-19 nested general pack: scanning an outer pack fills from nested BAK01.</w:t>
+      </w:r>
+    </w:p>
+    <w:p>
+      <w:pPr>
+        <w:pStyle w:val="ListBullet"/>
+      </w:pPr>
+      <w:r>
+        <w:t>PPB-17 internal: scanning on an internal-destination transfer retains the package as result_package.</w:t>
+      </w:r>
+    </w:p>
+    <w:p>
+      <w:pPr>
+        <w:pStyle w:val="ListBullet"/>
+      </w:pPr>
+      <w:r>
+        <w:t>PPB-17 customer: scanning on a customer delivery leaves no result package (dissolve).</w:t>
+      </w:r>
+    </w:p>
     <w:sectPr>
       <w:pgSz w:w="12240" w:h="15840"/>
       <w:pgMar w:top="1440" w:right="1800" w:bottom="1440" w:left="1800" w:header="720" w:footer="720" w:gutter="0"/>

</xml_diff>

<commit_message>
rental_scanning: Phase 2 - Barcode app package-scan integration (defensive)
OWL patch of BarcodePickingModel._processPackage: a scanned package WITH
contents on a stock.picking is routed through stock.picking.rental_scanning_
scan (strict-fit, idempotent, PPB-17) and the client reloads via refresh,
replacing the native line-per-quant overflow. Overflow opens a Split &
continue dialog; server errors surface as notifications. Empty packages,
package types, put-in-pack, batches and any failure fall back to native, so
the patch cannot break the Barcode app.

Deferred (need browser verification): set/serial barcode-app scanning and
scan-to-remove (both available via the backend action). Version 19.0.1.3.0.

Co-Authored-By: Claude Opus 4.8 <noreply@anthropic.com>
Claude-Session: https://claude.ai/code/session_015UyktmijNHjiCtQB359rzX
</commit_message>
<xml_diff>
--- a/docs/rental_scanning_requirements.docx
+++ b/docs/rental_scanning_requirements.docx
@@ -3730,6 +3730,86 @@
         <w:t>PPB-17 customer: scanning on a customer delivery leaves no result package (dissolve).</w:t>
       </w:r>
     </w:p>
+    <w:p>
+      <w:pPr>
+        <w:pStyle w:val="Heading1"/>
+      </w:pPr>
+      <w:r>
+        <w:t>15. Addendum v8 — Phase 2: Barcode app integration</w:t>
+      </w:r>
+    </w:p>
+    <w:p>
+      <w:r>
+        <w:rPr>
+          <w:i w:val="0"/>
+        </w:rPr>
+        <w:t>Routes a scanned package in the Barcode app through the same server reconciliation as the backend, replacing the native line-per-quant overflow.</w:t>
+      </w:r>
+    </w:p>
+    <w:p>
+      <w:pPr>
+        <w:pStyle w:val="Heading2"/>
+      </w:pPr>
+      <w:r>
+        <w:t>15.1 Implemented</w:t>
+      </w:r>
+    </w:p>
+    <w:p>
+      <w:pPr>
+        <w:pStyle w:val="ListBullet"/>
+      </w:pPr>
+      <w:r>
+        <w:t>OWL patch of BarcodePickingModel._processPackage: when a package WITH contents is scanned on a stock.picking, it calls stock.picking.rental_scanning_scan (strict-fit, idempotent, PPB-17) and reloads the client (trigger "refresh").</w:t>
+      </w:r>
+    </w:p>
+    <w:p>
+      <w:pPr>
+        <w:pStyle w:val="ListBullet"/>
+      </w:pPr>
+      <w:r>
+        <w:t>Overflow -&gt; a confirmation dialog ("Split &amp; continue") re-calls with allow_split; server errors (not demanded / wrong location) show as notifications.</w:t>
+      </w:r>
+    </w:p>
+    <w:p>
+      <w:pPr>
+        <w:pStyle w:val="ListBullet"/>
+      </w:pPr>
+      <w:r>
+        <w:t>Defensive: empty packages, package types, put-in-pack, batches and any unexpected failure fall back to native behaviour, so the patch cannot break the Barcode app.</w:t>
+      </w:r>
+    </w:p>
+    <w:p>
+      <w:pPr>
+        <w:pStyle w:val="Heading2"/>
+      </w:pPr>
+      <w:r>
+        <w:t>15.2 Deferred (follow-up, need UX/browser verification)</w:t>
+      </w:r>
+    </w:p>
+    <w:p>
+      <w:pPr>
+        <w:pStyle w:val="ListBullet"/>
+      </w:pPr>
+      <w:r>
+        <w:t>Scanning a SET barcode or a SERIAL directly in the Barcode app (these go through native product/lot handling, not _processPackage). They work today via the backend "Assign Prepared Package" action.</w:t>
+      </w:r>
+    </w:p>
+    <w:p>
+      <w:pPr>
+        <w:pStyle w:val="ListBullet"/>
+      </w:pPr>
+      <w:r>
+        <w:t>Scan-to-remove in the Barcode app: semantics overlap with idempotent re-scan; needs a UX decision. Backend "Remove Scanned Package" works.</w:t>
+      </w:r>
+    </w:p>
+    <w:p>
+      <w:pPr>
+        <w:pStyle w:val="ListBullet"/>
+      </w:pPr>
+      <w:r>
+        <w:t>Browser/tour verification required (cannot be run headless in this env).</w:t>
+      </w:r>
+    </w:p>
     <w:sectPr>
       <w:pgSz w:w="12240" w:h="15840"/>
       <w:pgMar w:top="1440" w:right="1800" w:bottom="1440" w:left="1800" w:header="720" w:footer="720" w:gutter="0"/>

</xml_diff>

<commit_message>
rental_scanning: split dissolves the whole package (unpack) + warn package is lost
Per decision: a split now OPENS the package entirely. _rs_apply unpacks the
scanned package (stock.package.unpack -> all contents loose), picks the
needed portion loose, leaves the excess loose at source, and the package no
longer exists. The overflow/split warning states the package will be
dissolved and lost. Fixes the leftover staying sealed in the package and the
'two locations' error. Version 19.0.1.5.0.

Co-Authored-By: Claude Opus 4.8 <noreply@anthropic.com>
Claude-Session: https://claude.ai/code/session_015UyktmijNHjiCtQB359rzX
</commit_message>
<xml_diff>
--- a/docs/rental_scanning_requirements.docx
+++ b/docs/rental_scanning_requirements.docx
@@ -3810,6 +3810,38 @@
         <w:t>Browser/tour verification required (cannot be run headless in this env).</w:t>
       </w:r>
     </w:p>
+    <w:p>
+      <w:pPr>
+        <w:pStyle w:val="Heading1"/>
+      </w:pPr>
+      <w:r>
+        <w:t>16. Addendum v9 — split dissolves the whole package</w:t>
+      </w:r>
+    </w:p>
+    <w:p>
+      <w:pPr>
+        <w:pStyle w:val="ListBullet"/>
+      </w:pPr>
+      <w:r>
+        <w:t>Decision: on a split (package has more than needed), the package is dissolved ENTIRELY, not partially. The whole package is unpacked (stock.package.unpack) so all contents become loose; the needed portion is picked, the excess stays loose at the source, and the package no longer exists in the system.</w:t>
+      </w:r>
+    </w:p>
+    <w:p>
+      <w:pPr>
+        <w:pStyle w:val="ListBullet"/>
+      </w:pPr>
+      <w:r>
+        <w:t>The split confirmation warning now states the package will be dissolved and lost.</w:t>
+      </w:r>
+    </w:p>
+    <w:p>
+      <w:pPr>
+        <w:pStyle w:val="ListBullet"/>
+      </w:pPr>
+      <w:r>
+        <w:t>Rationale: once a package is opened to remove excess, it is no longer a sealed package; keeping a partial package (source=result) is illegal in Odoo (cannot split a package across two locations). For multi-step consolidation use Put in Pack (Path A) to build a fresh traveling package.</w:t>
+      </w:r>
+    </w:p>
     <w:sectPr>
       <w:pgSz w:w="12240" w:h="15840"/>
       <w:pgMar w:top="1440" w:right="1800" w:bottom="1440" w:left="1800" w:header="720" w:footer="720" w:gutter="0"/>

</xml_diff>